<commit_message>
vault backup: 2026-10-29 11:59:16
</commit_message>
<xml_diff>
--- a/EMB/EMB_Fryba_06.docx
+++ b/EMB/EMB_Fryba_06.docx
@@ -33,10 +33,7 @@
         <w:pStyle w:val="Heading2"/>
       </w:pPr>
       <w:r>
-        <w:t>Měření malého odporu Ohmovou metodou</w:t>
-      </w:r>
-      <w:r>
-        <w:t>:</w:t>
+        <w:t>Měření malého odporu Ohmovou metodou:</w:t>
       </w:r>
     </w:p>
     <w:p>
@@ -55,19 +52,7 @@
         <w:t>3.</w:t>
       </w:r>
       <w:r>
-        <w:t>1. Vhodnou metodikou měření vylučte vliv</w:t>
-      </w:r>
-      <w:r>
-        <w:t xml:space="preserve"> </w:t>
-      </w:r>
-      <w:r>
-        <w:t>termoelektrických napětí. Z naměřených hodnot napětí a proudu vypočtěte</w:t>
-      </w:r>
-      <w:r>
-        <w:t xml:space="preserve"> </w:t>
-      </w:r>
-      <w:r>
-        <w:t xml:space="preserve">velikost neznámého odporu </w:t>
+        <w:t xml:space="preserve">1. Vhodnou metodikou měření vylučte vliv termoelektrických napětí. Z naměřených hodnot napětí a proudu vypočtěte velikost neznámého odporu </w:t>
       </w:r>
       <w:proofErr w:type="spellStart"/>
       <w:r>
@@ -582,10 +567,7 @@
         <w:t>2</w:t>
       </w:r>
       <w:r>
-        <w:t xml:space="preserve">, </w:t>
-      </w:r>
-      <w:r>
-        <w:t xml:space="preserve">= </w:t>
+        <w:t xml:space="preserve">, = </w:t>
       </w:r>
       <w:proofErr w:type="spellStart"/>
       <w:r>
@@ -599,13 +581,7 @@
       </w:r>
       <w:proofErr w:type="spellEnd"/>
       <w:r>
-        <w:t xml:space="preserve"> </w:t>
-      </w:r>
-      <w:r>
-        <w:t>(ΔR)</w:t>
-      </w:r>
-      <w:r>
-        <w:t>. To</w:t>
+        <w:t xml:space="preserve"> (ΔR). To</w:t>
       </w:r>
       <w:r>
         <w:t xml:space="preserve"> </w:t>
@@ -673,51 +649,23 @@
           <w:i/>
           <w:iCs/>
         </w:rPr>
-        <w:t>Prostudujte si teoretický úvod a případně související přednášky se zaměřením na</w:t>
-      </w:r>
-      <w:r>
+        <w:t>Prostudujte si teoretický úvod a případně související přednášky se zaměřením na pochopení principu a účelu měření úlohy.</w:t>
+      </w:r>
+    </w:p>
+    <w:p>
+      <w:pPr>
+        <w:pStyle w:val="Heading2"/>
         <w:rPr>
           <w:i/>
           <w:iCs/>
         </w:rPr>
-        <w:t xml:space="preserve"> </w:t>
-      </w:r>
+      </w:pPr>
       <w:r>
         <w:rPr>
           <w:i/>
           <w:iCs/>
         </w:rPr>
-        <w:t>pochopení principu a účelu měření úlohy.</w:t>
-      </w:r>
-    </w:p>
-    <w:p>
-      <w:pPr>
-        <w:pStyle w:val="Heading2"/>
-        <w:rPr>
-          <w:i/>
-          <w:iCs/>
-        </w:rPr>
-      </w:pPr>
-      <w:r>
-        <w:rPr>
-          <w:i/>
-          <w:iCs/>
-        </w:rPr>
-        <w:t>Proč se pro napájení můstku definovaným proudem používá zdroj proudu s OZ, a</w:t>
-      </w:r>
-      <w:r>
-        <w:rPr>
-          <w:i/>
-          <w:iCs/>
-        </w:rPr>
-        <w:t xml:space="preserve"> </w:t>
-      </w:r>
-      <w:r>
-        <w:rPr>
-          <w:i/>
-          <w:iCs/>
-        </w:rPr>
-        <w:t>ne pouze rezistor s velkou hodnotou zapojený do série se zdrojem napětí?</w:t>
+        <w:t>Proč se pro napájení můstku definovaným proudem používá zdroj proudu s OZ, a ne pouze rezistor s velkou hodnotou zapojený do série se zdrojem napětí?</w:t>
       </w:r>
     </w:p>
     <w:p>
@@ -753,10 +701,7 @@
         <w:pStyle w:val="Heading2"/>
       </w:pPr>
       <w:r>
-        <w:t>ODVOĎTE teoretický výsledný vztah pro výstupní napětí UBD rozváženého</w:t>
-      </w:r>
-      <w:r>
-        <w:t xml:space="preserve"> </w:t>
+        <w:t xml:space="preserve">ODVOĎTE teoretický výsledný vztah pro výstupní napětí UBD rozváženého </w:t>
       </w:r>
       <w:proofErr w:type="spellStart"/>
       <w:r>
@@ -764,13 +709,7 @@
       </w:r>
       <w:proofErr w:type="spellEnd"/>
       <w:r>
-        <w:t xml:space="preserve"> můstku napájeného ze zdroje napětí odpovídající rozvážení</w:t>
-      </w:r>
-      <w:r>
-        <w:t xml:space="preserve"> </w:t>
-      </w:r>
-      <w:r>
-        <w:t>o hodnotu ΔR0, obr. 6.</w:t>
+        <w:t xml:space="preserve"> můstku napájeného ze zdroje napětí odpovídající rozvážení o hodnotu ΔR0, obr. 6.</w:t>
       </w:r>
       <w:r>
         <w:t>3.</w:t>
@@ -2983,15 +2922,7 @@
           <w:kern w:val="0"/>
           <w14:ligatures w14:val="none"/>
         </w:rPr>
-        <w:t xml:space="preserve"> z</w:t>
-      </w:r>
-      <w:r>
-        <w:rPr>
-          <w:rFonts w:eastAsia="Times New Roman" w:cs="Times New Roman"/>
-          <w:kern w:val="0"/>
-          <w14:ligatures w14:val="none"/>
-        </w:rPr>
-        <w:t>e jmenovatele je výsledný vztah s patrným členem nelinearity:</w:t>
+        <w:t xml:space="preserve"> ze jmenovatele je výsledný vztah s patrným členem nelinearity:</w:t>
       </w:r>
       <w:r>
         <w:rPr>
@@ -3248,10 +3179,7 @@
         <w:pStyle w:val="Heading2"/>
       </w:pPr>
       <w:r>
-        <w:t>ODVOĎTE teoretický výsledný vztah pro výstupní napětí UBD rozváženého</w:t>
-      </w:r>
-      <w:r>
-        <w:t xml:space="preserve"> </w:t>
+        <w:t xml:space="preserve">ODVOĎTE teoretický výsledný vztah pro výstupní napětí UBD rozváženého </w:t>
       </w:r>
       <w:proofErr w:type="spellStart"/>
       <w:r>
@@ -3259,13 +3187,7 @@
       </w:r>
       <w:proofErr w:type="spellEnd"/>
       <w:r>
-        <w:t xml:space="preserve"> můstku napájeného ze zdroje proudu odpovídající rozvážení</w:t>
-      </w:r>
-      <w:r>
-        <w:t xml:space="preserve"> </w:t>
-      </w:r>
-      <w:r>
-        <w:t>o hodnotu ΔR0, obr. 6.</w:t>
+        <w:t xml:space="preserve"> můstku napájeného ze zdroje proudu odpovídající rozvážení o hodnotu ΔR0, obr. 6.</w:t>
       </w:r>
       <w:r>
         <w:t>3.</w:t>
@@ -6042,6 +5964,9 @@
             </m:den>
           </m:f>
           <m:r>
+            <m:rPr>
+              <m:sty m:val="p"/>
+            </m:rPr>
             <w:rPr>
               <w:rFonts w:eastAsia="Times New Roman" w:cs="Times New Roman"/>
               <w:kern w:val="0"/>
@@ -6082,6 +6007,9 @@
         <w:jc w:val="center"/>
       </w:pPr>
       <w:r>
+        <w:rPr>
+          <w:noProof/>
+        </w:rPr>
         <w:drawing>
           <wp:inline distT="0" distB="0" distL="0" distR="0" wp14:anchorId="66FBDA21" wp14:editId="69D616A7">
             <wp:extent cx="2154477" cy="1145872"/>
@@ -6176,6 +6104,9 @@
         <w:jc w:val="center"/>
       </w:pPr>
       <w:r>
+        <w:rPr>
+          <w:noProof/>
+        </w:rPr>
         <w:drawing>
           <wp:inline distT="0" distB="0" distL="0" distR="0" wp14:anchorId="4B12CD53" wp14:editId="61F1E4C6">
             <wp:extent cx="2496441" cy="1954060"/>
@@ -6278,6 +6209,9 @@
         <w:jc w:val="center"/>
       </w:pPr>
       <w:r>
+        <w:rPr>
+          <w:noProof/>
+        </w:rPr>
         <w:drawing>
           <wp:inline distT="0" distB="0" distL="0" distR="0" wp14:anchorId="3CC5DF79" wp14:editId="24FDEF2E">
             <wp:extent cx="2762042" cy="2204580"/>
@@ -6380,6 +6314,9 @@
         <w:jc w:val="center"/>
       </w:pPr>
       <w:r>
+        <w:rPr>
+          <w:noProof/>
+        </w:rPr>
         <w:drawing>
           <wp:inline distT="0" distB="0" distL="0" distR="0" wp14:anchorId="06DDC3C6" wp14:editId="31A016DC">
             <wp:extent cx="3003375" cy="1753292"/>
@@ -6479,6 +6416,186 @@
     </w:p>
     <w:p>
       <w:pPr>
+        <w:pStyle w:val="ListParagraph"/>
+        <w:numPr>
+          <w:ilvl w:val="0"/>
+          <w:numId w:val="12"/>
+        </w:numPr>
+      </w:pPr>
+      <w:r>
+        <w:t>Stabilizovaný zdroj Tesla BK 125 (</w:t>
+      </w:r>
+      <m:oMath>
+        <m:r>
+          <w:rPr>
+            <w:rFonts w:ascii="Cambria Math" w:hAnsi="Cambria Math"/>
+          </w:rPr>
+          <m:t>±15V DC</m:t>
+        </m:r>
+      </m:oMath>
+      <w:r>
+        <w:rPr>
+          <w:rFonts w:eastAsiaTheme="minorEastAsia"/>
+        </w:rPr>
+        <w:t>)</w:t>
+      </w:r>
+    </w:p>
+    <w:p>
+      <w:pPr>
+        <w:pStyle w:val="ListParagraph"/>
+        <w:numPr>
+          <w:ilvl w:val="0"/>
+          <w:numId w:val="12"/>
+        </w:numPr>
+      </w:pPr>
+      <w:r>
+        <w:rPr>
+          <w:rFonts w:eastAsiaTheme="minorEastAsia"/>
+        </w:rPr>
+        <w:t xml:space="preserve">Stejnosměrný zdroj s ampérmetrem </w:t>
+      </w:r>
+      <w:proofErr w:type="spellStart"/>
+      <w:r>
+        <w:rPr>
+          <w:rFonts w:eastAsiaTheme="minorEastAsia"/>
+        </w:rPr>
+        <w:t>Agilent</w:t>
+      </w:r>
+      <w:proofErr w:type="spellEnd"/>
+      <w:r>
+        <w:rPr>
+          <w:rFonts w:eastAsiaTheme="minorEastAsia"/>
+        </w:rPr>
+        <w:t xml:space="preserve"> E3640A</w:t>
+      </w:r>
+    </w:p>
+    <w:p>
+      <w:pPr>
+        <w:pStyle w:val="ListParagraph"/>
+        <w:numPr>
+          <w:ilvl w:val="0"/>
+          <w:numId w:val="12"/>
+        </w:numPr>
+      </w:pPr>
+      <w:r>
+        <w:t>Přípravek s OZ OP07</w:t>
+      </w:r>
+    </w:p>
+    <w:p>
+      <w:pPr>
+        <w:pStyle w:val="ListParagraph"/>
+        <w:numPr>
+          <w:ilvl w:val="0"/>
+          <w:numId w:val="16"/>
+        </w:numPr>
+      </w:pPr>
+      <w:r>
+        <w:t>Přípravek s </w:t>
+      </w:r>
+      <w:proofErr w:type="spellStart"/>
+      <w:r>
+        <w:t>Wheatonovým</w:t>
+      </w:r>
+      <w:proofErr w:type="spellEnd"/>
+      <w:r>
+        <w:t xml:space="preserve"> můstkem</w:t>
+      </w:r>
+    </w:p>
+    <w:p>
+      <w:pPr>
+        <w:pStyle w:val="ListParagraph"/>
+        <w:numPr>
+          <w:ilvl w:val="0"/>
+          <w:numId w:val="16"/>
+        </w:numPr>
+      </w:pPr>
+      <w:r>
+        <w:t>Odporová dekáda</w:t>
+      </w:r>
+    </w:p>
+    <w:p>
+      <w:pPr>
+        <w:pStyle w:val="ListParagraph"/>
+        <w:numPr>
+          <w:ilvl w:val="0"/>
+          <w:numId w:val="16"/>
+        </w:numPr>
+      </w:pPr>
+      <w:r>
+        <w:t xml:space="preserve">Přípravek s rezistory (tolerance </w:t>
+      </w:r>
+      <w:proofErr w:type="gramStart"/>
+      <w:r>
+        <w:t>0,1%</w:t>
+      </w:r>
+      <w:proofErr w:type="gramEnd"/>
+      <w:r>
+        <w:t>)</w:t>
+      </w:r>
+    </w:p>
+    <w:p>
+      <w:pPr>
+        <w:pStyle w:val="ListParagraph"/>
+        <w:numPr>
+          <w:ilvl w:val="0"/>
+          <w:numId w:val="16"/>
+        </w:numPr>
+      </w:pPr>
+      <w:r>
+        <w:t xml:space="preserve">Digitální multimetr </w:t>
+      </w:r>
+      <w:proofErr w:type="spellStart"/>
+      <w:r>
+        <w:t>Keysight</w:t>
+      </w:r>
+      <w:proofErr w:type="spellEnd"/>
+      <w:r>
+        <w:t xml:space="preserve"> </w:t>
+      </w:r>
+      <w:proofErr w:type="gramStart"/>
+      <w:r>
+        <w:t>34460A</w:t>
+      </w:r>
+      <w:proofErr w:type="gramEnd"/>
+    </w:p>
+    <w:p>
+      <w:pPr>
+        <w:pStyle w:val="ListParagraph"/>
+        <w:numPr>
+          <w:ilvl w:val="0"/>
+          <w:numId w:val="16"/>
+        </w:numPr>
+      </w:pPr>
+      <w:r>
+        <w:t>Reostat</w:t>
+      </w:r>
+    </w:p>
+    <w:p>
+      <w:pPr>
+        <w:pStyle w:val="ListParagraph"/>
+        <w:numPr>
+          <w:ilvl w:val="0"/>
+          <w:numId w:val="16"/>
+        </w:numPr>
+      </w:pPr>
+      <w:r>
+        <w:t>Měřený přípravek s malým odporem</w:t>
+      </w:r>
+    </w:p>
+    <w:p>
+      <w:pPr>
+        <w:pStyle w:val="ListParagraph"/>
+        <w:numPr>
+          <w:ilvl w:val="0"/>
+          <w:numId w:val="16"/>
+        </w:numPr>
+      </w:pPr>
+      <w:r>
+        <w:t>Propojovací kabely</w:t>
+      </w:r>
+    </w:p>
+    <w:p>
+      <w:pPr>
         <w:pStyle w:val="Heading1"/>
       </w:pPr>
       <w:bookmarkStart w:id="2" w:name="_Domácí_příprava"/>
@@ -6487,6 +6604,1080 @@
         <w:t>Naměřené hodnoty</w:t>
       </w:r>
     </w:p>
+    <w:p>
+      <w:pPr>
+        <w:rPr>
+          <w:b/>
+          <w:bCs/>
+        </w:rPr>
+      </w:pPr>
+      <w:r>
+        <w:rPr>
+          <w:b/>
+          <w:bCs/>
+        </w:rPr>
+        <w:t>Zadání 6.1.1</w:t>
+      </w:r>
+    </w:p>
+    <w:p>
+      <w:r>
+        <w:t xml:space="preserve">V tomto kroku zadání bylo potřeba použít </w:t>
+      </w:r>
+      <w:r>
+        <w:t>Ohmovu</w:t>
+      </w:r>
+      <w:r>
+        <w:t xml:space="preserve"> metodu ke změření úbytku napětí </w:t>
+      </w:r>
+      <w:r>
+        <w:t>U</w:t>
+      </w:r>
+      <w:r>
+        <w:rPr>
+          <w:vertAlign w:val="subscript"/>
+        </w:rPr>
+        <w:t>x</w:t>
+      </w:r>
+      <w:r>
+        <w:t xml:space="preserve"> </w:t>
+      </w:r>
+      <w:r>
+        <w:t>na přípravku s</w:t>
+      </w:r>
+      <w:r>
+        <w:t xml:space="preserve"> </w:t>
+      </w:r>
+      <w:r>
+        <w:t>malým odporem</w:t>
+      </w:r>
+      <w:r>
+        <w:t xml:space="preserve"> </w:t>
+      </w:r>
+      <w:proofErr w:type="spellStart"/>
+      <w:r>
+        <w:t>R</w:t>
+      </w:r>
+      <w:r>
+        <w:rPr>
+          <w:vertAlign w:val="subscript"/>
+        </w:rPr>
+        <w:t>x</w:t>
+      </w:r>
+      <w:proofErr w:type="spellEnd"/>
+      <w:r>
+        <w:t>.</w:t>
+      </w:r>
+      <w:r>
+        <w:t xml:space="preserve"> Měření probíhala s</w:t>
+      </w:r>
+      <w:r>
+        <w:t xml:space="preserve"> </w:t>
+      </w:r>
+      <w:r>
+        <w:t xml:space="preserve">hodnotou proudu </w:t>
+      </w:r>
+      <m:oMath>
+        <m:r>
+          <w:rPr>
+            <w:rFonts w:ascii="Cambria Math" w:eastAsia="Times New Roman" w:hAnsi="Cambria Math" w:cs="Times New Roman"/>
+          </w:rPr>
+          <m:t>I=2 A</m:t>
+        </m:r>
+      </m:oMath>
+      <w:r>
+        <w:rPr>
+          <w:rFonts w:eastAsiaTheme="minorEastAsia"/>
+          <w:iCs/>
+        </w:rPr>
+        <w:t xml:space="preserve"> a s</w:t>
+      </w:r>
+      <w:r>
+        <w:rPr>
+          <w:rFonts w:eastAsiaTheme="minorEastAsia"/>
+          <w:iCs/>
+        </w:rPr>
+        <w:t xml:space="preserve"> </w:t>
+      </w:r>
+      <w:r>
+        <w:rPr>
+          <w:rFonts w:eastAsiaTheme="minorEastAsia"/>
+          <w:iCs/>
+        </w:rPr>
+        <w:t xml:space="preserve">rozsahem multimetru </w:t>
+      </w:r>
+      <m:oMath>
+        <m:r>
+          <w:rPr>
+            <w:rFonts w:ascii="Cambria Math" w:eastAsiaTheme="minorEastAsia" w:hAnsi="Cambria Math"/>
+          </w:rPr>
+          <m:t>100mV</m:t>
+        </m:r>
+      </m:oMath>
+      <w:r>
+        <w:rPr>
+          <w:rFonts w:eastAsiaTheme="minorEastAsia"/>
+          <w:iCs/>
+        </w:rPr>
+        <w:t xml:space="preserve">. </w:t>
+      </w:r>
+      <w:r>
+        <w:rPr>
+          <w:rFonts w:eastAsiaTheme="minorEastAsia"/>
+          <w:iCs/>
+        </w:rPr>
+        <w:t>Poté proběhla komutace, pro vyloučení termoelektrických napětí. Komutací se změnilo i celkové napětí zdroje U.</w:t>
+      </w:r>
+    </w:p>
+    <w:tbl>
+      <w:tblPr>
+        <w:tblW w:w="4170" w:type="dxa"/>
+        <w:jc w:val="center"/>
+        <w:tblCellMar>
+          <w:left w:w="70" w:type="dxa"/>
+          <w:right w:w="70" w:type="dxa"/>
+        </w:tblCellMar>
+        <w:tblLook w:val="04A0" w:firstRow="1" w:lastRow="0" w:firstColumn="1" w:lastColumn="0" w:noHBand="0" w:noVBand="1"/>
+      </w:tblPr>
+      <w:tblGrid>
+        <w:gridCol w:w="999"/>
+        <w:gridCol w:w="1724"/>
+        <w:gridCol w:w="1447"/>
+      </w:tblGrid>
+      <w:tr>
+        <w:trPr>
+          <w:trHeight w:val="300"/>
+          <w:jc w:val="center"/>
+        </w:trPr>
+        <w:tc>
+          <w:tcPr>
+            <w:tcW w:w="999" w:type="dxa"/>
+            <w:tcBorders>
+              <w:top w:val="single" w:sz="8" w:space="0" w:color="auto"/>
+              <w:left w:val="single" w:sz="8" w:space="0" w:color="auto"/>
+              <w:bottom w:val="single" w:sz="8" w:space="0" w:color="auto"/>
+              <w:right w:val="single" w:sz="4" w:space="0" w:color="auto"/>
+            </w:tcBorders>
+            <w:shd w:val="clear" w:color="auto" w:fill="7F7F7F" w:themeFill="text1" w:themeFillTint="80"/>
+          </w:tcPr>
+          <w:p>
+            <w:pPr>
+              <w:spacing w:after="0" w:line="240" w:lineRule="auto"/>
+              <w:rPr>
+                <w:rFonts w:eastAsia="Times New Roman" w:cs="Times New Roman"/>
+                <w:b/>
+                <w:bCs/>
+                <w:color w:val="000000"/>
+                <w:kern w:val="0"/>
+                <w:sz w:val="22"/>
+                <w:szCs w:val="22"/>
+                <w:lang w:eastAsia="cs-CZ"/>
+                <w14:ligatures w14:val="none"/>
+              </w:rPr>
+            </w:pPr>
+          </w:p>
+        </w:tc>
+        <w:tc>
+          <w:tcPr>
+            <w:tcW w:w="1724" w:type="dxa"/>
+            <w:tcBorders>
+              <w:top w:val="single" w:sz="8" w:space="0" w:color="auto"/>
+              <w:left w:val="single" w:sz="8" w:space="0" w:color="auto"/>
+              <w:bottom w:val="single" w:sz="8" w:space="0" w:color="auto"/>
+              <w:right w:val="single" w:sz="4" w:space="0" w:color="auto"/>
+            </w:tcBorders>
+            <w:shd w:val="clear" w:color="000000" w:fill="D9D9D9"/>
+            <w:noWrap/>
+            <w:vAlign w:val="bottom"/>
+            <w:hideMark/>
+          </w:tcPr>
+          <w:p>
+            <w:pPr>
+              <w:spacing w:after="0" w:line="240" w:lineRule="auto"/>
+              <w:jc w:val="center"/>
+              <w:rPr>
+                <w:rFonts w:eastAsia="Times New Roman" w:cs="Times New Roman"/>
+                <w:b/>
+                <w:bCs/>
+                <w:color w:val="000000"/>
+                <w:kern w:val="0"/>
+                <w:sz w:val="22"/>
+                <w:szCs w:val="22"/>
+                <w:lang w:eastAsia="cs-CZ"/>
+                <w14:ligatures w14:val="none"/>
+              </w:rPr>
+            </w:pPr>
+            <w:r>
+              <w:rPr>
+                <w:rFonts w:eastAsia="Times New Roman" w:cs="Times New Roman"/>
+                <w:b/>
+                <w:bCs/>
+                <w:color w:val="000000"/>
+                <w:kern w:val="0"/>
+                <w:sz w:val="22"/>
+                <w:szCs w:val="22"/>
+                <w:lang w:eastAsia="cs-CZ"/>
+                <w14:ligatures w14:val="none"/>
+              </w:rPr>
+              <w:t>Před komutací</w:t>
+            </w:r>
+          </w:p>
+        </w:tc>
+        <w:tc>
+          <w:tcPr>
+            <w:tcW w:w="1447" w:type="dxa"/>
+            <w:tcBorders>
+              <w:top w:val="single" w:sz="8" w:space="0" w:color="auto"/>
+              <w:left w:val="nil"/>
+              <w:bottom w:val="single" w:sz="8" w:space="0" w:color="auto"/>
+              <w:right w:val="single" w:sz="8" w:space="0" w:color="auto"/>
+            </w:tcBorders>
+            <w:shd w:val="clear" w:color="000000" w:fill="D9D9D9"/>
+            <w:noWrap/>
+            <w:vAlign w:val="bottom"/>
+            <w:hideMark/>
+          </w:tcPr>
+          <w:p>
+            <w:pPr>
+              <w:spacing w:after="0" w:line="240" w:lineRule="auto"/>
+              <w:jc w:val="center"/>
+              <w:rPr>
+                <w:rFonts w:eastAsia="Times New Roman" w:cs="Times New Roman"/>
+                <w:b/>
+                <w:bCs/>
+                <w:color w:val="000000"/>
+                <w:kern w:val="0"/>
+                <w:sz w:val="22"/>
+                <w:szCs w:val="22"/>
+                <w:lang w:eastAsia="cs-CZ"/>
+                <w14:ligatures w14:val="none"/>
+              </w:rPr>
+            </w:pPr>
+            <w:r>
+              <w:rPr>
+                <w:rFonts w:eastAsia="Times New Roman" w:cs="Times New Roman"/>
+                <w:b/>
+                <w:bCs/>
+                <w:color w:val="000000"/>
+                <w:kern w:val="0"/>
+                <w:sz w:val="22"/>
+                <w:szCs w:val="22"/>
+                <w:lang w:eastAsia="cs-CZ"/>
+                <w14:ligatures w14:val="none"/>
+              </w:rPr>
+              <w:t>Po komutaci</w:t>
+            </w:r>
+          </w:p>
+        </w:tc>
+      </w:tr>
+      <w:tr>
+        <w:trPr>
+          <w:trHeight w:val="290"/>
+          <w:jc w:val="center"/>
+        </w:trPr>
+        <w:tc>
+          <w:tcPr>
+            <w:tcW w:w="999" w:type="dxa"/>
+            <w:tcBorders>
+              <w:top w:val="nil"/>
+              <w:left w:val="single" w:sz="8" w:space="0" w:color="auto"/>
+              <w:bottom w:val="single" w:sz="4" w:space="0" w:color="auto"/>
+              <w:right w:val="single" w:sz="4" w:space="0" w:color="auto"/>
+            </w:tcBorders>
+            <w:shd w:val="clear" w:color="auto" w:fill="D1D1D1" w:themeFill="background2" w:themeFillShade="E6"/>
+          </w:tcPr>
+          <w:p>
+            <w:pPr>
+              <w:tabs>
+                <w:tab w:val="center" w:pos="410"/>
+                <w:tab w:val="right" w:pos="820"/>
+              </w:tabs>
+              <w:spacing w:after="0" w:line="240" w:lineRule="auto"/>
+              <w:jc w:val="center"/>
+              <w:rPr>
+                <w:rFonts w:eastAsia="Times New Roman" w:cs="Times New Roman"/>
+                <w:b/>
+                <w:bCs/>
+                <w:color w:val="000000"/>
+                <w:kern w:val="0"/>
+                <w:sz w:val="22"/>
+                <w:szCs w:val="22"/>
+                <w:lang w:eastAsia="cs-CZ"/>
+                <w14:ligatures w14:val="none"/>
+              </w:rPr>
+            </w:pPr>
+            <w:r>
+              <w:rPr>
+                <w:rFonts w:eastAsia="Times New Roman" w:cs="Times New Roman"/>
+                <w:b/>
+                <w:bCs/>
+                <w:color w:val="000000"/>
+                <w:kern w:val="0"/>
+                <w:sz w:val="22"/>
+                <w:szCs w:val="22"/>
+                <w:lang w:eastAsia="cs-CZ"/>
+                <w14:ligatures w14:val="none"/>
+              </w:rPr>
+              <w:t>U</w:t>
+            </w:r>
+            <w:r>
+              <w:rPr>
+                <w:rFonts w:eastAsia="Times New Roman" w:cs="Times New Roman"/>
+                <w:b/>
+                <w:bCs/>
+                <w:color w:val="000000"/>
+                <w:kern w:val="0"/>
+                <w:sz w:val="22"/>
+                <w:szCs w:val="22"/>
+                <w:vertAlign w:val="subscript"/>
+                <w:lang w:eastAsia="cs-CZ"/>
+                <w14:ligatures w14:val="none"/>
+              </w:rPr>
+              <w:t>x</w:t>
+            </w:r>
+            <w:r>
+              <w:rPr>
+                <w:rFonts w:eastAsia="Times New Roman" w:cs="Times New Roman"/>
+                <w:b/>
+                <w:bCs/>
+                <w:color w:val="000000"/>
+                <w:kern w:val="0"/>
+                <w:sz w:val="22"/>
+                <w:szCs w:val="22"/>
+                <w:lang w:eastAsia="cs-CZ"/>
+                <w14:ligatures w14:val="none"/>
+              </w:rPr>
+              <w:t xml:space="preserve"> [</w:t>
+            </w:r>
+            <w:proofErr w:type="spellStart"/>
+            <w:r>
+              <w:rPr>
+                <w:rFonts w:eastAsia="Times New Roman" w:cs="Times New Roman"/>
+                <w:b/>
+                <w:bCs/>
+                <w:color w:val="000000"/>
+                <w:kern w:val="0"/>
+                <w:sz w:val="22"/>
+                <w:szCs w:val="22"/>
+                <w:lang w:eastAsia="cs-CZ"/>
+                <w14:ligatures w14:val="none"/>
+              </w:rPr>
+              <w:t>mV</w:t>
+            </w:r>
+            <w:proofErr w:type="spellEnd"/>
+            <w:r>
+              <w:rPr>
+                <w:rFonts w:eastAsia="Times New Roman" w:cs="Times New Roman"/>
+                <w:b/>
+                <w:bCs/>
+                <w:color w:val="000000"/>
+                <w:kern w:val="0"/>
+                <w:sz w:val="22"/>
+                <w:szCs w:val="22"/>
+                <w:lang w:eastAsia="cs-CZ"/>
+                <w14:ligatures w14:val="none"/>
+              </w:rPr>
+              <w:t>]</w:t>
+            </w:r>
+          </w:p>
+        </w:tc>
+        <w:tc>
+          <w:tcPr>
+            <w:tcW w:w="1724" w:type="dxa"/>
+            <w:tcBorders>
+              <w:top w:val="nil"/>
+              <w:left w:val="single" w:sz="8" w:space="0" w:color="auto"/>
+              <w:bottom w:val="single" w:sz="4" w:space="0" w:color="auto"/>
+              <w:right w:val="single" w:sz="4" w:space="0" w:color="auto"/>
+            </w:tcBorders>
+            <w:noWrap/>
+            <w:vAlign w:val="bottom"/>
+            <w:hideMark/>
+          </w:tcPr>
+          <w:p>
+            <w:pPr>
+              <w:spacing w:after="0" w:line="240" w:lineRule="auto"/>
+              <w:jc w:val="center"/>
+              <w:rPr>
+                <w:rFonts w:eastAsia="Times New Roman" w:cs="Times New Roman"/>
+                <w:color w:val="000000"/>
+                <w:kern w:val="0"/>
+                <w:sz w:val="22"/>
+                <w:szCs w:val="22"/>
+                <w:lang w:eastAsia="cs-CZ"/>
+                <w14:ligatures w14:val="none"/>
+              </w:rPr>
+            </w:pPr>
+            <w:r>
+              <w:rPr>
+                <w:rFonts w:eastAsia="Times New Roman" w:cs="Times New Roman"/>
+                <w:color w:val="000000"/>
+                <w:kern w:val="0"/>
+                <w:sz w:val="22"/>
+                <w:szCs w:val="22"/>
+                <w:lang w:eastAsia="cs-CZ"/>
+                <w14:ligatures w14:val="none"/>
+              </w:rPr>
+              <w:t>23,073</w:t>
+            </w:r>
+          </w:p>
+        </w:tc>
+        <w:tc>
+          <w:tcPr>
+            <w:tcW w:w="1447" w:type="dxa"/>
+            <w:tcBorders>
+              <w:top w:val="nil"/>
+              <w:left w:val="nil"/>
+              <w:bottom w:val="single" w:sz="4" w:space="0" w:color="auto"/>
+              <w:right w:val="single" w:sz="8" w:space="0" w:color="auto"/>
+            </w:tcBorders>
+            <w:noWrap/>
+            <w:vAlign w:val="bottom"/>
+            <w:hideMark/>
+          </w:tcPr>
+          <w:p>
+            <w:pPr>
+              <w:keepNext/>
+              <w:spacing w:after="0" w:line="240" w:lineRule="auto"/>
+              <w:jc w:val="center"/>
+              <w:rPr>
+                <w:rFonts w:eastAsia="Times New Roman" w:cs="Times New Roman"/>
+                <w:color w:val="000000"/>
+                <w:kern w:val="0"/>
+                <w:sz w:val="22"/>
+                <w:szCs w:val="22"/>
+                <w:lang w:eastAsia="cs-CZ"/>
+                <w14:ligatures w14:val="none"/>
+              </w:rPr>
+            </w:pPr>
+            <w:r>
+              <w:rPr>
+                <w:rFonts w:eastAsia="Times New Roman" w:cs="Times New Roman"/>
+                <w:color w:val="000000"/>
+                <w:kern w:val="0"/>
+                <w:sz w:val="22"/>
+                <w:szCs w:val="22"/>
+                <w:lang w:eastAsia="cs-CZ"/>
+                <w14:ligatures w14:val="none"/>
+              </w:rPr>
+              <w:t>-</w:t>
+            </w:r>
+            <w:r>
+              <w:rPr>
+                <w:rFonts w:eastAsia="Times New Roman" w:cs="Times New Roman"/>
+                <w:color w:val="000000"/>
+                <w:kern w:val="0"/>
+                <w:sz w:val="22"/>
+                <w:szCs w:val="22"/>
+                <w:lang w:eastAsia="cs-CZ"/>
+                <w14:ligatures w14:val="none"/>
+              </w:rPr>
+              <w:t>23,0</w:t>
+            </w:r>
+            <w:r>
+              <w:rPr>
+                <w:rFonts w:eastAsia="Times New Roman" w:cs="Times New Roman"/>
+                <w:color w:val="000000"/>
+                <w:kern w:val="0"/>
+                <w:sz w:val="22"/>
+                <w:szCs w:val="22"/>
+                <w:lang w:eastAsia="cs-CZ"/>
+                <w14:ligatures w14:val="none"/>
+              </w:rPr>
+              <w:t>57</w:t>
+            </w:r>
+          </w:p>
+        </w:tc>
+      </w:tr>
+      <w:tr>
+        <w:trPr>
+          <w:trHeight w:val="290"/>
+          <w:jc w:val="center"/>
+        </w:trPr>
+        <w:tc>
+          <w:tcPr>
+            <w:tcW w:w="999" w:type="dxa"/>
+            <w:tcBorders>
+              <w:top w:val="single" w:sz="4" w:space="0" w:color="auto"/>
+              <w:left w:val="single" w:sz="8" w:space="0" w:color="auto"/>
+              <w:bottom w:val="single" w:sz="4" w:space="0" w:color="auto"/>
+              <w:right w:val="single" w:sz="4" w:space="0" w:color="auto"/>
+            </w:tcBorders>
+            <w:shd w:val="clear" w:color="auto" w:fill="D1D1D1" w:themeFill="background2" w:themeFillShade="E6"/>
+          </w:tcPr>
+          <w:p>
+            <w:pPr>
+              <w:tabs>
+                <w:tab w:val="center" w:pos="410"/>
+                <w:tab w:val="right" w:pos="820"/>
+              </w:tabs>
+              <w:spacing w:after="0" w:line="240" w:lineRule="auto"/>
+              <w:jc w:val="center"/>
+              <w:rPr>
+                <w:rFonts w:eastAsia="Times New Roman" w:cs="Times New Roman"/>
+                <w:b/>
+                <w:bCs/>
+                <w:color w:val="000000"/>
+                <w:kern w:val="0"/>
+                <w:sz w:val="22"/>
+                <w:szCs w:val="22"/>
+                <w:lang w:eastAsia="cs-CZ"/>
+                <w14:ligatures w14:val="none"/>
+              </w:rPr>
+            </w:pPr>
+            <w:r>
+              <w:rPr>
+                <w:rFonts w:eastAsia="Times New Roman" w:cs="Times New Roman"/>
+                <w:b/>
+                <w:bCs/>
+                <w:color w:val="000000"/>
+                <w:kern w:val="0"/>
+                <w:sz w:val="22"/>
+                <w:szCs w:val="22"/>
+                <w:lang w:eastAsia="cs-CZ"/>
+                <w14:ligatures w14:val="none"/>
+              </w:rPr>
+              <w:t>U [V]</w:t>
+            </w:r>
+          </w:p>
+        </w:tc>
+        <w:tc>
+          <w:tcPr>
+            <w:tcW w:w="1724" w:type="dxa"/>
+            <w:tcBorders>
+              <w:top w:val="single" w:sz="4" w:space="0" w:color="auto"/>
+              <w:left w:val="single" w:sz="8" w:space="0" w:color="auto"/>
+              <w:bottom w:val="single" w:sz="4" w:space="0" w:color="auto"/>
+              <w:right w:val="single" w:sz="4" w:space="0" w:color="auto"/>
+            </w:tcBorders>
+            <w:noWrap/>
+            <w:vAlign w:val="bottom"/>
+          </w:tcPr>
+          <w:p>
+            <w:pPr>
+              <w:spacing w:after="0" w:line="240" w:lineRule="auto"/>
+              <w:jc w:val="center"/>
+              <w:rPr>
+                <w:rFonts w:eastAsia="Times New Roman" w:cs="Times New Roman"/>
+                <w:color w:val="000000"/>
+                <w:kern w:val="0"/>
+                <w:sz w:val="22"/>
+                <w:szCs w:val="22"/>
+                <w:lang w:eastAsia="cs-CZ"/>
+                <w14:ligatures w14:val="none"/>
+              </w:rPr>
+            </w:pPr>
+            <w:r>
+              <w:rPr>
+                <w:rFonts w:eastAsia="Times New Roman" w:cs="Times New Roman"/>
+                <w:color w:val="000000"/>
+                <w:kern w:val="0"/>
+                <w:sz w:val="22"/>
+                <w:szCs w:val="22"/>
+                <w:lang w:eastAsia="cs-CZ"/>
+                <w14:ligatures w14:val="none"/>
+              </w:rPr>
+              <w:t>0,92</w:t>
+            </w:r>
+          </w:p>
+        </w:tc>
+        <w:tc>
+          <w:tcPr>
+            <w:tcW w:w="1447" w:type="dxa"/>
+            <w:tcBorders>
+              <w:top w:val="single" w:sz="4" w:space="0" w:color="auto"/>
+              <w:left w:val="nil"/>
+              <w:bottom w:val="single" w:sz="4" w:space="0" w:color="auto"/>
+              <w:right w:val="single" w:sz="8" w:space="0" w:color="auto"/>
+            </w:tcBorders>
+            <w:noWrap/>
+            <w:vAlign w:val="bottom"/>
+          </w:tcPr>
+          <w:p>
+            <w:pPr>
+              <w:keepNext/>
+              <w:spacing w:after="0" w:line="240" w:lineRule="auto"/>
+              <w:jc w:val="center"/>
+              <w:rPr>
+                <w:rFonts w:eastAsia="Times New Roman" w:cs="Times New Roman"/>
+                <w:color w:val="000000"/>
+                <w:kern w:val="0"/>
+                <w:sz w:val="22"/>
+                <w:szCs w:val="22"/>
+                <w:lang w:eastAsia="cs-CZ"/>
+                <w14:ligatures w14:val="none"/>
+              </w:rPr>
+            </w:pPr>
+            <w:r>
+              <w:rPr>
+                <w:rFonts w:eastAsia="Times New Roman" w:cs="Times New Roman"/>
+                <w:color w:val="000000"/>
+                <w:kern w:val="0"/>
+                <w:sz w:val="22"/>
+                <w:szCs w:val="22"/>
+                <w:lang w:eastAsia="cs-CZ"/>
+                <w14:ligatures w14:val="none"/>
+              </w:rPr>
+              <w:t>0,52</w:t>
+            </w:r>
+          </w:p>
+        </w:tc>
+      </w:tr>
+    </w:tbl>
+    <w:p>
+      <w:pPr>
+        <w:rPr>
+          <w:b/>
+          <w:bCs/>
+        </w:rPr>
+      </w:pPr>
+      <w:r>
+        <w:rPr>
+          <w:b/>
+          <w:bCs/>
+        </w:rPr>
+        <w:t>Zadání 6.1.2</w:t>
+      </w:r>
+    </w:p>
+    <w:p>
+      <w:r>
+        <w:t>Pro porovnání s předchozím zadáním</w:t>
+      </w:r>
+      <w:r>
+        <w:t xml:space="preserve"> bylo měření </w:t>
+      </w:r>
+      <w:r>
+        <w:t xml:space="preserve">odporu </w:t>
+      </w:r>
+      <w:proofErr w:type="spellStart"/>
+      <w:r>
+        <w:t>R</w:t>
+      </w:r>
+      <w:r>
+        <w:rPr>
+          <w:vertAlign w:val="subscript"/>
+        </w:rPr>
+        <w:t>x</w:t>
+      </w:r>
+      <w:proofErr w:type="spellEnd"/>
+      <w:r>
+        <w:t xml:space="preserve"> </w:t>
+      </w:r>
+      <w:r>
+        <w:t xml:space="preserve">provedeno </w:t>
+      </w:r>
+      <w:r>
+        <w:t>i pouze</w:t>
+      </w:r>
+      <w:r>
+        <w:t xml:space="preserve"> </w:t>
+      </w:r>
+      <w:r>
+        <w:t>multimetre. Nejdříve obyčejným měřením odporu</w:t>
+      </w:r>
+      <w:r>
+        <w:t xml:space="preserve"> (2W režim), </w:t>
+      </w:r>
+      <w:r>
+        <w:t>který do měření přidává</w:t>
+      </w:r>
+      <w:r>
+        <w:t xml:space="preserve"> </w:t>
+      </w:r>
+      <w:r>
+        <w:t>chybu</w:t>
+      </w:r>
+      <w:r>
+        <w:t xml:space="preserve"> metody</w:t>
+      </w:r>
+      <w:r>
+        <w:t xml:space="preserve"> až 0,2 </w:t>
+      </w:r>
+      <w:r>
+        <w:t>Ω</w:t>
+      </w:r>
+      <w:r>
+        <w:t>.</w:t>
+      </w:r>
+      <w:r>
+        <w:t xml:space="preserve"> </w:t>
+      </w:r>
+      <w:r>
+        <w:t xml:space="preserve">A </w:t>
+      </w:r>
+      <w:r>
+        <w:t xml:space="preserve">poté </w:t>
+      </w:r>
+      <w:proofErr w:type="gramStart"/>
+      <w:r>
+        <w:t>4-svorkovým</w:t>
+      </w:r>
+      <w:proofErr w:type="gramEnd"/>
+      <w:r>
+        <w:t xml:space="preserve"> režimem</w:t>
+      </w:r>
+      <w:r>
+        <w:t xml:space="preserve"> (</w:t>
+      </w:r>
+      <w:proofErr w:type="gramStart"/>
+      <w:r>
+        <w:t>4W</w:t>
+      </w:r>
+      <w:proofErr w:type="gramEnd"/>
+      <w:r>
+        <w:t>)</w:t>
+      </w:r>
+      <w:r>
+        <w:t xml:space="preserve">, který </w:t>
+      </w:r>
+      <w:r>
+        <w:t>používá k měření právě Ohmovu metodu</w:t>
+      </w:r>
+      <w:r>
+        <w:t xml:space="preserve"> a je tedy výrazně přesnější</w:t>
+      </w:r>
+      <w:r>
+        <w:t>.</w:t>
+      </w:r>
+    </w:p>
+    <w:tbl>
+      <w:tblPr>
+        <w:tblW w:w="3780" w:type="dxa"/>
+        <w:jc w:val="center"/>
+        <w:tblCellMar>
+          <w:left w:w="70" w:type="dxa"/>
+          <w:right w:w="70" w:type="dxa"/>
+        </w:tblCellMar>
+        <w:tblLook w:val="04A0" w:firstRow="1" w:lastRow="0" w:firstColumn="1" w:lastColumn="0" w:noHBand="0" w:noVBand="1"/>
+      </w:tblPr>
+      <w:tblGrid>
+        <w:gridCol w:w="829"/>
+        <w:gridCol w:w="1511"/>
+        <w:gridCol w:w="1440"/>
+      </w:tblGrid>
+      <w:tr>
+        <w:trPr>
+          <w:trHeight w:val="300"/>
+          <w:jc w:val="center"/>
+        </w:trPr>
+        <w:tc>
+          <w:tcPr>
+            <w:tcW w:w="829" w:type="dxa"/>
+            <w:tcBorders>
+              <w:top w:val="single" w:sz="8" w:space="0" w:color="auto"/>
+              <w:left w:val="single" w:sz="8" w:space="0" w:color="auto"/>
+              <w:bottom w:val="single" w:sz="8" w:space="0" w:color="auto"/>
+              <w:right w:val="single" w:sz="4" w:space="0" w:color="auto"/>
+            </w:tcBorders>
+            <w:shd w:val="clear" w:color="auto" w:fill="7F7F7F" w:themeFill="text1" w:themeFillTint="80"/>
+          </w:tcPr>
+          <w:p>
+            <w:pPr>
+              <w:spacing w:after="0" w:line="240" w:lineRule="auto"/>
+              <w:rPr>
+                <w:rFonts w:eastAsia="Times New Roman" w:cs="Times New Roman"/>
+                <w:b/>
+                <w:bCs/>
+                <w:color w:val="000000"/>
+                <w:kern w:val="0"/>
+                <w:sz w:val="22"/>
+                <w:szCs w:val="22"/>
+                <w:lang w:eastAsia="cs-CZ"/>
+                <w14:ligatures w14:val="none"/>
+              </w:rPr>
+            </w:pPr>
+          </w:p>
+        </w:tc>
+        <w:tc>
+          <w:tcPr>
+            <w:tcW w:w="1511" w:type="dxa"/>
+            <w:tcBorders>
+              <w:top w:val="single" w:sz="8" w:space="0" w:color="auto"/>
+              <w:left w:val="single" w:sz="8" w:space="0" w:color="auto"/>
+              <w:bottom w:val="single" w:sz="8" w:space="0" w:color="auto"/>
+              <w:right w:val="single" w:sz="4" w:space="0" w:color="auto"/>
+            </w:tcBorders>
+            <w:shd w:val="clear" w:color="000000" w:fill="D9D9D9"/>
+            <w:noWrap/>
+            <w:vAlign w:val="bottom"/>
+            <w:hideMark/>
+          </w:tcPr>
+          <w:p>
+            <w:pPr>
+              <w:spacing w:after="0" w:line="240" w:lineRule="auto"/>
+              <w:jc w:val="center"/>
+              <w:rPr>
+                <w:rFonts w:eastAsia="Times New Roman" w:cs="Times New Roman"/>
+                <w:b/>
+                <w:bCs/>
+                <w:color w:val="000000"/>
+                <w:kern w:val="0"/>
+                <w:sz w:val="22"/>
+                <w:szCs w:val="22"/>
+                <w:lang w:eastAsia="cs-CZ"/>
+                <w14:ligatures w14:val="none"/>
+              </w:rPr>
+            </w:pPr>
+            <w:r>
+              <w:rPr>
+                <w:rFonts w:eastAsia="Times New Roman" w:cs="Times New Roman"/>
+                <w:b/>
+                <w:bCs/>
+                <w:color w:val="000000"/>
+                <w:kern w:val="0"/>
+                <w:sz w:val="22"/>
+                <w:szCs w:val="22"/>
+                <w:lang w:eastAsia="cs-CZ"/>
+                <w14:ligatures w14:val="none"/>
+              </w:rPr>
+              <w:t>2W režim</w:t>
+            </w:r>
+          </w:p>
+        </w:tc>
+        <w:tc>
+          <w:tcPr>
+            <w:tcW w:w="1440" w:type="dxa"/>
+            <w:tcBorders>
+              <w:top w:val="single" w:sz="8" w:space="0" w:color="auto"/>
+              <w:left w:val="nil"/>
+              <w:bottom w:val="single" w:sz="8" w:space="0" w:color="auto"/>
+              <w:right w:val="single" w:sz="8" w:space="0" w:color="auto"/>
+            </w:tcBorders>
+            <w:shd w:val="clear" w:color="000000" w:fill="D9D9D9"/>
+            <w:noWrap/>
+            <w:vAlign w:val="bottom"/>
+            <w:hideMark/>
+          </w:tcPr>
+          <w:p>
+            <w:pPr>
+              <w:spacing w:after="0" w:line="240" w:lineRule="auto"/>
+              <w:jc w:val="center"/>
+              <w:rPr>
+                <w:rFonts w:eastAsia="Times New Roman" w:cs="Times New Roman"/>
+                <w:b/>
+                <w:bCs/>
+                <w:color w:val="000000"/>
+                <w:kern w:val="0"/>
+                <w:sz w:val="22"/>
+                <w:szCs w:val="22"/>
+                <w:lang w:eastAsia="cs-CZ"/>
+                <w14:ligatures w14:val="none"/>
+              </w:rPr>
+            </w:pPr>
+            <w:r>
+              <w:rPr>
+                <w:rFonts w:eastAsia="Times New Roman" w:cs="Times New Roman"/>
+                <w:b/>
+                <w:bCs/>
+                <w:color w:val="000000"/>
+                <w:kern w:val="0"/>
+                <w:sz w:val="22"/>
+                <w:szCs w:val="22"/>
+                <w:lang w:eastAsia="cs-CZ"/>
+                <w14:ligatures w14:val="none"/>
+              </w:rPr>
+              <w:t>4W režim</w:t>
+            </w:r>
+          </w:p>
+        </w:tc>
+      </w:tr>
+      <w:tr>
+        <w:trPr>
+          <w:trHeight w:val="290"/>
+          <w:jc w:val="center"/>
+        </w:trPr>
+        <w:tc>
+          <w:tcPr>
+            <w:tcW w:w="829" w:type="dxa"/>
+            <w:tcBorders>
+              <w:top w:val="nil"/>
+              <w:left w:val="single" w:sz="8" w:space="0" w:color="auto"/>
+              <w:bottom w:val="single" w:sz="4" w:space="0" w:color="auto"/>
+              <w:right w:val="single" w:sz="4" w:space="0" w:color="auto"/>
+            </w:tcBorders>
+            <w:shd w:val="clear" w:color="auto" w:fill="D1D1D1" w:themeFill="background2" w:themeFillShade="E6"/>
+          </w:tcPr>
+          <w:p>
+            <w:pPr>
+              <w:tabs>
+                <w:tab w:val="center" w:pos="410"/>
+                <w:tab w:val="right" w:pos="820"/>
+              </w:tabs>
+              <w:spacing w:after="0" w:line="240" w:lineRule="auto"/>
+              <w:jc w:val="center"/>
+              <w:rPr>
+                <w:rFonts w:eastAsia="Times New Roman" w:cs="Times New Roman"/>
+                <w:b/>
+                <w:bCs/>
+                <w:color w:val="000000"/>
+                <w:kern w:val="0"/>
+                <w:sz w:val="22"/>
+                <w:szCs w:val="22"/>
+                <w:lang w:eastAsia="cs-CZ"/>
+                <w14:ligatures w14:val="none"/>
+              </w:rPr>
+            </w:pPr>
+            <w:proofErr w:type="spellStart"/>
+            <w:r>
+              <w:rPr>
+                <w:rFonts w:eastAsia="Times New Roman" w:cs="Times New Roman"/>
+                <w:b/>
+                <w:bCs/>
+                <w:color w:val="000000"/>
+                <w:kern w:val="0"/>
+                <w:sz w:val="22"/>
+                <w:szCs w:val="22"/>
+                <w:lang w:eastAsia="cs-CZ"/>
+                <w14:ligatures w14:val="none"/>
+              </w:rPr>
+              <w:t>R</w:t>
+            </w:r>
+            <w:r>
+              <w:rPr>
+                <w:rFonts w:eastAsia="Times New Roman" w:cs="Times New Roman"/>
+                <w:b/>
+                <w:bCs/>
+                <w:color w:val="000000"/>
+                <w:kern w:val="0"/>
+                <w:sz w:val="22"/>
+                <w:szCs w:val="22"/>
+                <w:vertAlign w:val="subscript"/>
+                <w:lang w:eastAsia="cs-CZ"/>
+                <w14:ligatures w14:val="none"/>
+              </w:rPr>
+              <w:t>x</w:t>
+            </w:r>
+            <w:proofErr w:type="spellEnd"/>
+            <w:r>
+              <w:rPr>
+                <w:rFonts w:eastAsia="Times New Roman" w:cs="Times New Roman"/>
+                <w:b/>
+                <w:bCs/>
+                <w:color w:val="000000"/>
+                <w:kern w:val="0"/>
+                <w:sz w:val="22"/>
+                <w:szCs w:val="22"/>
+                <w:lang w:eastAsia="cs-CZ"/>
+                <w14:ligatures w14:val="none"/>
+              </w:rPr>
+              <w:t xml:space="preserve"> [</w:t>
+            </w:r>
+            <w:r>
+              <w:rPr>
+                <w:rFonts w:eastAsia="Times New Roman" w:cs="Times New Roman"/>
+                <w:b/>
+                <w:bCs/>
+                <w:color w:val="000000"/>
+                <w:kern w:val="0"/>
+                <w:sz w:val="22"/>
+                <w:szCs w:val="22"/>
+                <w:lang w:eastAsia="cs-CZ"/>
+                <w14:ligatures w14:val="none"/>
+              </w:rPr>
+              <w:t>Ω</w:t>
+            </w:r>
+            <w:r>
+              <w:rPr>
+                <w:rFonts w:eastAsia="Times New Roman" w:cs="Times New Roman"/>
+                <w:b/>
+                <w:bCs/>
+                <w:color w:val="000000"/>
+                <w:kern w:val="0"/>
+                <w:sz w:val="22"/>
+                <w:szCs w:val="22"/>
+                <w:lang w:eastAsia="cs-CZ"/>
+                <w14:ligatures w14:val="none"/>
+              </w:rPr>
+              <w:t>]</w:t>
+            </w:r>
+          </w:p>
+        </w:tc>
+        <w:tc>
+          <w:tcPr>
+            <w:tcW w:w="1511" w:type="dxa"/>
+            <w:tcBorders>
+              <w:top w:val="nil"/>
+              <w:left w:val="single" w:sz="8" w:space="0" w:color="auto"/>
+              <w:bottom w:val="single" w:sz="4" w:space="0" w:color="auto"/>
+              <w:right w:val="single" w:sz="4" w:space="0" w:color="auto"/>
+            </w:tcBorders>
+            <w:noWrap/>
+            <w:vAlign w:val="bottom"/>
+            <w:hideMark/>
+          </w:tcPr>
+          <w:p>
+            <w:pPr>
+              <w:spacing w:after="0" w:line="240" w:lineRule="auto"/>
+              <w:jc w:val="center"/>
+              <w:rPr>
+                <w:rFonts w:eastAsia="Times New Roman" w:cs="Times New Roman"/>
+                <w:color w:val="000000"/>
+                <w:kern w:val="0"/>
+                <w:sz w:val="22"/>
+                <w:szCs w:val="22"/>
+                <w:lang w:eastAsia="cs-CZ"/>
+                <w14:ligatures w14:val="none"/>
+              </w:rPr>
+            </w:pPr>
+            <w:r>
+              <w:rPr>
+                <w:rFonts w:eastAsia="Times New Roman" w:cs="Times New Roman"/>
+                <w:color w:val="000000"/>
+                <w:kern w:val="0"/>
+                <w:sz w:val="22"/>
+                <w:szCs w:val="22"/>
+                <w:lang w:eastAsia="cs-CZ"/>
+                <w14:ligatures w14:val="none"/>
+              </w:rPr>
+              <w:t>0,113</w:t>
+            </w:r>
+          </w:p>
+        </w:tc>
+        <w:tc>
+          <w:tcPr>
+            <w:tcW w:w="1440" w:type="dxa"/>
+            <w:tcBorders>
+              <w:top w:val="nil"/>
+              <w:left w:val="nil"/>
+              <w:bottom w:val="single" w:sz="4" w:space="0" w:color="auto"/>
+              <w:right w:val="single" w:sz="8" w:space="0" w:color="auto"/>
+            </w:tcBorders>
+            <w:noWrap/>
+            <w:vAlign w:val="bottom"/>
+            <w:hideMark/>
+          </w:tcPr>
+          <w:p>
+            <w:pPr>
+              <w:keepNext/>
+              <w:spacing w:after="0" w:line="240" w:lineRule="auto"/>
+              <w:jc w:val="center"/>
+              <w:rPr>
+                <w:rFonts w:eastAsia="Times New Roman" w:cs="Times New Roman"/>
+                <w:color w:val="000000"/>
+                <w:kern w:val="0"/>
+                <w:sz w:val="22"/>
+                <w:szCs w:val="22"/>
+                <w:lang w:eastAsia="cs-CZ"/>
+                <w14:ligatures w14:val="none"/>
+              </w:rPr>
+            </w:pPr>
+            <w:r>
+              <w:rPr>
+                <w:rFonts w:eastAsia="Times New Roman" w:cs="Times New Roman"/>
+                <w:color w:val="000000"/>
+                <w:kern w:val="0"/>
+                <w:sz w:val="22"/>
+                <w:szCs w:val="22"/>
+                <w:lang w:eastAsia="cs-CZ"/>
+                <w14:ligatures w14:val="none"/>
+              </w:rPr>
+              <w:t>0,012</w:t>
+            </w:r>
+          </w:p>
+        </w:tc>
+      </w:tr>
+    </w:tbl>
+    <w:p/>
+    <w:p/>
     <w:p>
       <w:pPr>
         <w:pStyle w:val="Heading1"/>
@@ -7531,6 +8722,118 @@
     </w:lvl>
   </w:abstractNum>
   <w:abstractNum w:abstractNumId="8" w15:restartNumberingAfterBreak="0">
+    <w:nsid w:val="3DDF5CEF"/>
+    <w:multiLevelType w:val="hybridMultilevel"/>
+    <w:tmpl w:val="C4C8E646"/>
+    <w:lvl w:ilvl="0" w:tplc="FA7AC15E">
+      <w:numFmt w:val="bullet"/>
+      <w:lvlText w:val="-"/>
+      <w:lvlJc w:val="left"/>
+      <w:pPr>
+        <w:ind w:left="720" w:hanging="360"/>
+      </w:pPr>
+      <w:rPr>
+        <w:rFonts w:ascii="Aptos" w:eastAsiaTheme="minorHAnsi" w:hAnsi="Aptos" w:cs="Times New Roman (Body CS)" w:hint="default"/>
+      </w:rPr>
+    </w:lvl>
+    <w:lvl w:ilvl="1" w:tplc="04090003" w:tentative="1">
+      <w:start w:val="1"/>
+      <w:numFmt w:val="bullet"/>
+      <w:lvlText w:val="o"/>
+      <w:lvlJc w:val="left"/>
+      <w:pPr>
+        <w:ind w:left="1440" w:hanging="360"/>
+      </w:pPr>
+      <w:rPr>
+        <w:rFonts w:ascii="Courier New" w:hAnsi="Courier New" w:cs="Courier New" w:hint="default"/>
+      </w:rPr>
+    </w:lvl>
+    <w:lvl w:ilvl="2" w:tplc="04090005" w:tentative="1">
+      <w:start w:val="1"/>
+      <w:numFmt w:val="bullet"/>
+      <w:lvlText w:val=""/>
+      <w:lvlJc w:val="left"/>
+      <w:pPr>
+        <w:ind w:left="2160" w:hanging="360"/>
+      </w:pPr>
+      <w:rPr>
+        <w:rFonts w:ascii="Wingdings" w:hAnsi="Wingdings" w:hint="default"/>
+      </w:rPr>
+    </w:lvl>
+    <w:lvl w:ilvl="3" w:tplc="04090001" w:tentative="1">
+      <w:start w:val="1"/>
+      <w:numFmt w:val="bullet"/>
+      <w:lvlText w:val=""/>
+      <w:lvlJc w:val="left"/>
+      <w:pPr>
+        <w:ind w:left="2880" w:hanging="360"/>
+      </w:pPr>
+      <w:rPr>
+        <w:rFonts w:ascii="Symbol" w:hAnsi="Symbol" w:hint="default"/>
+      </w:rPr>
+    </w:lvl>
+    <w:lvl w:ilvl="4" w:tplc="04090003" w:tentative="1">
+      <w:start w:val="1"/>
+      <w:numFmt w:val="bullet"/>
+      <w:lvlText w:val="o"/>
+      <w:lvlJc w:val="left"/>
+      <w:pPr>
+        <w:ind w:left="3600" w:hanging="360"/>
+      </w:pPr>
+      <w:rPr>
+        <w:rFonts w:ascii="Courier New" w:hAnsi="Courier New" w:cs="Courier New" w:hint="default"/>
+      </w:rPr>
+    </w:lvl>
+    <w:lvl w:ilvl="5" w:tplc="04090005" w:tentative="1">
+      <w:start w:val="1"/>
+      <w:numFmt w:val="bullet"/>
+      <w:lvlText w:val=""/>
+      <w:lvlJc w:val="left"/>
+      <w:pPr>
+        <w:ind w:left="4320" w:hanging="360"/>
+      </w:pPr>
+      <w:rPr>
+        <w:rFonts w:ascii="Wingdings" w:hAnsi="Wingdings" w:hint="default"/>
+      </w:rPr>
+    </w:lvl>
+    <w:lvl w:ilvl="6" w:tplc="04090001" w:tentative="1">
+      <w:start w:val="1"/>
+      <w:numFmt w:val="bullet"/>
+      <w:lvlText w:val=""/>
+      <w:lvlJc w:val="left"/>
+      <w:pPr>
+        <w:ind w:left="5040" w:hanging="360"/>
+      </w:pPr>
+      <w:rPr>
+        <w:rFonts w:ascii="Symbol" w:hAnsi="Symbol" w:hint="default"/>
+      </w:rPr>
+    </w:lvl>
+    <w:lvl w:ilvl="7" w:tplc="04090003" w:tentative="1">
+      <w:start w:val="1"/>
+      <w:numFmt w:val="bullet"/>
+      <w:lvlText w:val="o"/>
+      <w:lvlJc w:val="left"/>
+      <w:pPr>
+        <w:ind w:left="5760" w:hanging="360"/>
+      </w:pPr>
+      <w:rPr>
+        <w:rFonts w:ascii="Courier New" w:hAnsi="Courier New" w:cs="Courier New" w:hint="default"/>
+      </w:rPr>
+    </w:lvl>
+    <w:lvl w:ilvl="8" w:tplc="04090005" w:tentative="1">
+      <w:start w:val="1"/>
+      <w:numFmt w:val="bullet"/>
+      <w:lvlText w:val=""/>
+      <w:lvlJc w:val="left"/>
+      <w:pPr>
+        <w:ind w:left="6480" w:hanging="360"/>
+      </w:pPr>
+      <w:rPr>
+        <w:rFonts w:ascii="Wingdings" w:hAnsi="Wingdings" w:hint="default"/>
+      </w:rPr>
+    </w:lvl>
+  </w:abstractNum>
+  <w:abstractNum w:abstractNumId="9" w15:restartNumberingAfterBreak="0">
     <w:nsid w:val="42AC04FE"/>
     <w:multiLevelType w:val="hybridMultilevel"/>
     <w:tmpl w:val="61A0A9B8"/>
@@ -7619,7 +8922,7 @@
       </w:pPr>
     </w:lvl>
   </w:abstractNum>
-  <w:abstractNum w:abstractNumId="9" w15:restartNumberingAfterBreak="0">
+  <w:abstractNum w:abstractNumId="10" w15:restartNumberingAfterBreak="0">
     <w:nsid w:val="447B6F56"/>
     <w:multiLevelType w:val="hybridMultilevel"/>
     <w:tmpl w:val="81D68592"/>
@@ -7708,7 +9011,7 @@
       </w:pPr>
     </w:lvl>
   </w:abstractNum>
-  <w:abstractNum w:abstractNumId="10" w15:restartNumberingAfterBreak="0">
+  <w:abstractNum w:abstractNumId="11" w15:restartNumberingAfterBreak="0">
     <w:nsid w:val="4C66307E"/>
     <w:multiLevelType w:val="hybridMultilevel"/>
     <w:tmpl w:val="87E60BD0"/>
@@ -7797,7 +9100,7 @@
       </w:pPr>
     </w:lvl>
   </w:abstractNum>
-  <w:abstractNum w:abstractNumId="11" w15:restartNumberingAfterBreak="0">
+  <w:abstractNum w:abstractNumId="12" w15:restartNumberingAfterBreak="0">
     <w:nsid w:val="6FDD4535"/>
     <w:multiLevelType w:val="hybridMultilevel"/>
     <w:tmpl w:val="92B4729C"/>
@@ -7910,7 +9213,7 @@
       </w:rPr>
     </w:lvl>
   </w:abstractNum>
-  <w:abstractNum w:abstractNumId="12" w15:restartNumberingAfterBreak="0">
+  <w:abstractNum w:abstractNumId="13" w15:restartNumberingAfterBreak="0">
     <w:nsid w:val="74B87641"/>
     <w:multiLevelType w:val="hybridMultilevel"/>
     <w:tmpl w:val="C28E6B3C"/>
@@ -8023,7 +9326,7 @@
       </w:rPr>
     </w:lvl>
   </w:abstractNum>
-  <w:abstractNum w:abstractNumId="13" w15:restartNumberingAfterBreak="0">
+  <w:abstractNum w:abstractNumId="14" w15:restartNumberingAfterBreak="0">
     <w:nsid w:val="776D61AC"/>
     <w:multiLevelType w:val="multilevel"/>
     <w:tmpl w:val="8D8A567A"/>
@@ -8109,7 +9412,7 @@
       </w:pPr>
     </w:lvl>
   </w:abstractNum>
-  <w:abstractNum w:abstractNumId="14" w15:restartNumberingAfterBreak="0">
+  <w:abstractNum w:abstractNumId="15" w15:restartNumberingAfterBreak="0">
     <w:nsid w:val="786C1F80"/>
     <w:multiLevelType w:val="multilevel"/>
     <w:tmpl w:val="C2F4B402"/>
@@ -8232,7 +9535,7 @@
     <w:abstractNumId w:val="3"/>
   </w:num>
   <w:num w:numId="3" w16cid:durableId="543249749">
-    <w:abstractNumId w:val="13"/>
+    <w:abstractNumId w:val="14"/>
   </w:num>
   <w:num w:numId="4" w16cid:durableId="626009306">
     <w:abstractNumId w:val="6"/>
@@ -8241,16 +9544,16 @@
     <w:abstractNumId w:val="1"/>
   </w:num>
   <w:num w:numId="6" w16cid:durableId="1898200284">
-    <w:abstractNumId w:val="12"/>
+    <w:abstractNumId w:val="13"/>
   </w:num>
   <w:num w:numId="7" w16cid:durableId="1084961518">
     <w:abstractNumId w:val="4"/>
   </w:num>
   <w:num w:numId="8" w16cid:durableId="1200044717">
-    <w:abstractNumId w:val="8"/>
+    <w:abstractNumId w:val="9"/>
   </w:num>
   <w:num w:numId="9" w16cid:durableId="2087651579">
-    <w:abstractNumId w:val="9"/>
+    <w:abstractNumId w:val="10"/>
   </w:num>
   <w:num w:numId="10" w16cid:durableId="871767152">
     <w:abstractNumId w:val="2"/>
@@ -8262,13 +9565,16 @@
     <w:abstractNumId w:val="0"/>
   </w:num>
   <w:num w:numId="13" w16cid:durableId="1192449291">
-    <w:abstractNumId w:val="10"/>
+    <w:abstractNumId w:val="11"/>
   </w:num>
   <w:num w:numId="14" w16cid:durableId="538662206">
-    <w:abstractNumId w:val="14"/>
+    <w:abstractNumId w:val="15"/>
   </w:num>
   <w:num w:numId="15" w16cid:durableId="371416986">
-    <w:abstractNumId w:val="11"/>
+    <w:abstractNumId w:val="12"/>
+  </w:num>
+  <w:num w:numId="16" w16cid:durableId="1255553697">
+    <w:abstractNumId w:val="8"/>
   </w:num>
 </w:numbering>
 </file>
@@ -8673,7 +9979,7 @@
   <w:style w:type="paragraph" w:default="1" w:styleId="Normal">
     <w:name w:val="Normal"/>
     <w:qFormat/>
-    <w:rsid w:val="005853CD"/>
+    <w:rsid w:val="00C10363"/>
     <w:pPr>
       <w:spacing w:after="120"/>
       <w:jc w:val="both"/>

</xml_diff>

<commit_message>
vault backup: 2026-10-30 09:19:15
</commit_message>
<xml_diff>
--- a/EMB/EMB_Fryba_06.docx
+++ b/EMB/EMB_Fryba_06.docx
@@ -6055,45 +6055,25 @@
       <w:r>
         <w:t xml:space="preserve">Obrázek </w:t>
       </w:r>
-      <w:r>
-        <w:fldChar w:fldCharType="begin"/>
-      </w:r>
-      <w:r>
-        <w:instrText xml:space="preserve"> STYLEREF 1 \s </w:instrText>
-      </w:r>
-      <w:r>
-        <w:fldChar w:fldCharType="separate"/>
-      </w:r>
-      <w:r>
-        <w:rPr>
-          <w:noProof/>
-        </w:rPr>
-        <w:t>6.3</w:t>
-      </w:r>
-      <w:r>
-        <w:fldChar w:fldCharType="end"/>
-      </w:r>
+      <w:fldSimple w:instr=" STYLEREF 1 \s ">
+        <w:r>
+          <w:rPr>
+            <w:noProof/>
+          </w:rPr>
+          <w:t>6.3</w:t>
+        </w:r>
+      </w:fldSimple>
       <w:r>
         <w:t>.</w:t>
       </w:r>
-      <w:r>
-        <w:fldChar w:fldCharType="begin"/>
-      </w:r>
-      <w:r>
-        <w:instrText xml:space="preserve"> SEQ Obrázek \* ARABIC \s 1 </w:instrText>
-      </w:r>
-      <w:r>
-        <w:fldChar w:fldCharType="separate"/>
-      </w:r>
-      <w:r>
-        <w:rPr>
-          <w:noProof/>
-        </w:rPr>
-        <w:t>1</w:t>
-      </w:r>
-      <w:r>
-        <w:fldChar w:fldCharType="end"/>
-      </w:r>
+      <w:fldSimple w:instr=" SEQ Obrázek \* ARABIC \s 1 ">
+        <w:r>
+          <w:rPr>
+            <w:noProof/>
+          </w:rPr>
+          <w:t>1</w:t>
+        </w:r>
+      </w:fldSimple>
       <w:r>
         <w:t xml:space="preserve"> Měření malého odporu ohmovou metodou</w:t>
       </w:r>
@@ -6152,45 +6132,25 @@
       <w:r>
         <w:t xml:space="preserve">Obrázek </w:t>
       </w:r>
-      <w:r>
-        <w:fldChar w:fldCharType="begin"/>
-      </w:r>
-      <w:r>
-        <w:instrText xml:space="preserve"> STYLEREF 1 \s </w:instrText>
-      </w:r>
-      <w:r>
-        <w:fldChar w:fldCharType="separate"/>
-      </w:r>
-      <w:r>
-        <w:rPr>
-          <w:noProof/>
-        </w:rPr>
-        <w:t>6.3</w:t>
-      </w:r>
-      <w:r>
-        <w:fldChar w:fldCharType="end"/>
-      </w:r>
+      <w:fldSimple w:instr=" STYLEREF 1 \s ">
+        <w:r>
+          <w:rPr>
+            <w:noProof/>
+          </w:rPr>
+          <w:t>6.3</w:t>
+        </w:r>
+      </w:fldSimple>
       <w:r>
         <w:t>.</w:t>
       </w:r>
-      <w:r>
-        <w:fldChar w:fldCharType="begin"/>
-      </w:r>
-      <w:r>
-        <w:instrText xml:space="preserve"> SEQ Obrázek \* ARABIC \s 1 </w:instrText>
-      </w:r>
-      <w:r>
-        <w:fldChar w:fldCharType="separate"/>
-      </w:r>
-      <w:r>
-        <w:rPr>
-          <w:noProof/>
-        </w:rPr>
-        <w:t>2</w:t>
-      </w:r>
-      <w:r>
-        <w:fldChar w:fldCharType="end"/>
-      </w:r>
+      <w:fldSimple w:instr=" SEQ Obrázek \* ARABIC \s 1 ">
+        <w:r>
+          <w:rPr>
+            <w:noProof/>
+          </w:rPr>
+          <w:t>2</w:t>
+        </w:r>
+      </w:fldSimple>
       <w:r>
         <w:t xml:space="preserve"> </w:t>
       </w:r>
@@ -6257,45 +6217,25 @@
       <w:r>
         <w:t xml:space="preserve">Obrázek </w:t>
       </w:r>
-      <w:r>
-        <w:fldChar w:fldCharType="begin"/>
-      </w:r>
-      <w:r>
-        <w:instrText xml:space="preserve"> STYLEREF 1 \s </w:instrText>
-      </w:r>
-      <w:r>
-        <w:fldChar w:fldCharType="separate"/>
-      </w:r>
-      <w:r>
-        <w:rPr>
-          <w:noProof/>
-        </w:rPr>
-        <w:t>6.3</w:t>
-      </w:r>
-      <w:r>
-        <w:fldChar w:fldCharType="end"/>
-      </w:r>
+      <w:fldSimple w:instr=" STYLEREF 1 \s ">
+        <w:r>
+          <w:rPr>
+            <w:noProof/>
+          </w:rPr>
+          <w:t>6.3</w:t>
+        </w:r>
+      </w:fldSimple>
       <w:r>
         <w:t>.</w:t>
       </w:r>
-      <w:r>
-        <w:fldChar w:fldCharType="begin"/>
-      </w:r>
-      <w:r>
-        <w:instrText xml:space="preserve"> SEQ Obrázek \* ARABIC \s 1 </w:instrText>
-      </w:r>
-      <w:r>
-        <w:fldChar w:fldCharType="separate"/>
-      </w:r>
-      <w:r>
-        <w:rPr>
-          <w:noProof/>
-        </w:rPr>
-        <w:t>3</w:t>
-      </w:r>
-      <w:r>
-        <w:fldChar w:fldCharType="end"/>
-      </w:r>
+      <w:fldSimple w:instr=" SEQ Obrázek \* ARABIC \s 1 ">
+        <w:r>
+          <w:rPr>
+            <w:noProof/>
+          </w:rPr>
+          <w:t>3</w:t>
+        </w:r>
+      </w:fldSimple>
       <w:r>
         <w:t xml:space="preserve"> </w:t>
       </w:r>
@@ -6362,45 +6302,25 @@
       <w:r>
         <w:t xml:space="preserve">Obrázek </w:t>
       </w:r>
-      <w:r>
-        <w:fldChar w:fldCharType="begin"/>
-      </w:r>
-      <w:r>
-        <w:instrText xml:space="preserve"> STYLEREF 1 \s </w:instrText>
-      </w:r>
-      <w:r>
-        <w:fldChar w:fldCharType="separate"/>
-      </w:r>
-      <w:r>
-        <w:rPr>
-          <w:noProof/>
-        </w:rPr>
-        <w:t>6.3</w:t>
-      </w:r>
-      <w:r>
-        <w:fldChar w:fldCharType="end"/>
-      </w:r>
+      <w:fldSimple w:instr=" STYLEREF 1 \s ">
+        <w:r>
+          <w:rPr>
+            <w:noProof/>
+          </w:rPr>
+          <w:t>6.3</w:t>
+        </w:r>
+      </w:fldSimple>
       <w:r>
         <w:t>.</w:t>
       </w:r>
-      <w:r>
-        <w:fldChar w:fldCharType="begin"/>
-      </w:r>
-      <w:r>
-        <w:instrText xml:space="preserve"> SEQ Obrázek \* ARABIC \s 1 </w:instrText>
-      </w:r>
-      <w:r>
-        <w:fldChar w:fldCharType="separate"/>
-      </w:r>
-      <w:r>
-        <w:rPr>
-          <w:noProof/>
-        </w:rPr>
-        <w:t>4</w:t>
-      </w:r>
-      <w:r>
-        <w:fldChar w:fldCharType="end"/>
-      </w:r>
+      <w:fldSimple w:instr=" SEQ Obrázek \* ARABIC \s 1 ">
+        <w:r>
+          <w:rPr>
+            <w:noProof/>
+          </w:rPr>
+          <w:t>4</w:t>
+        </w:r>
+      </w:fldSimple>
       <w:r>
         <w:t xml:space="preserve"> Schéma „linearizovaného“ můstku</w:t>
       </w:r>
@@ -7059,31 +6979,7 @@
                 <w:lang w:eastAsia="cs-CZ"/>
                 <w14:ligatures w14:val="none"/>
               </w:rPr>
-              <w:t>-</w:t>
-            </w:r>
-            <w:r>
-              <w:rPr>
-                <w:rFonts w:eastAsia="Times New Roman" w:cs="Times New Roman"/>
-                <w:color w:val="000000"/>
-                <w:kern w:val="0"/>
-                <w:sz w:val="22"/>
-                <w:szCs w:val="22"/>
-                <w:lang w:eastAsia="cs-CZ"/>
-                <w14:ligatures w14:val="none"/>
-              </w:rPr>
-              <w:t>23,0</w:t>
-            </w:r>
-            <w:r>
-              <w:rPr>
-                <w:rFonts w:eastAsia="Times New Roman" w:cs="Times New Roman"/>
-                <w:color w:val="000000"/>
-                <w:kern w:val="0"/>
-                <w:sz w:val="22"/>
-                <w:szCs w:val="22"/>
-                <w:lang w:eastAsia="cs-CZ"/>
-                <w14:ligatures w14:val="none"/>
-              </w:rPr>
-              <w:t>57</w:t>
+              <w:t>-23,057</w:t>
             </w:r>
           </w:p>
         </w:tc>
@@ -7676,8 +7572,727 @@
         </w:tc>
       </w:tr>
     </w:tbl>
+    <w:p>
+      <w:r>
+        <w:t>Zadání 6.1.3</w:t>
+      </w:r>
+    </w:p>
+    <w:p>
+      <w:pPr>
+        <w:rPr>
+          <w:rFonts w:eastAsia="Times New Roman" w:cs="Times New Roman"/>
+          <w:color w:val="000000"/>
+          <w:kern w:val="0"/>
+          <w:sz w:val="22"/>
+          <w:szCs w:val="22"/>
+          <w:lang w:eastAsia="cs-CZ"/>
+          <w14:ligatures w14:val="none"/>
+        </w:rPr>
+      </w:pPr>
+      <w:r>
+        <w:t xml:space="preserve">Nyní se pro měření odporu použil </w:t>
+      </w:r>
+      <w:proofErr w:type="spellStart"/>
+      <w:r>
+        <w:t>Wheatonův</w:t>
+      </w:r>
+      <w:proofErr w:type="spellEnd"/>
+      <w:r>
+        <w:t xml:space="preserve"> můstek. Namísto přípravku s potenciometrem simulující odporové teploměry, u kterého by hrála velkou roli nepřesnost lidského faktoru, byla využita právě odporová dekáda vyvážená rezistorem o hodnotě R</w:t>
+      </w:r>
+      <w:r>
+        <w:rPr>
+          <w:vertAlign w:val="subscript"/>
+        </w:rPr>
+        <w:t>D</w:t>
+      </w:r>
+      <w:r>
+        <w:t xml:space="preserve"> = 1k</w:t>
+      </w:r>
+      <w:r>
+        <w:rPr>
+          <w:rFonts w:eastAsia="Times New Roman" w:cs="Times New Roman"/>
+          <w:color w:val="000000"/>
+          <w:kern w:val="0"/>
+          <w:sz w:val="22"/>
+          <w:szCs w:val="22"/>
+          <w:lang w:eastAsia="cs-CZ"/>
+          <w14:ligatures w14:val="none"/>
+        </w:rPr>
+        <w:t>Ω</w:t>
+      </w:r>
+      <w:r>
+        <w:rPr>
+          <w:rFonts w:eastAsia="Times New Roman" w:cs="Times New Roman"/>
+          <w:color w:val="000000"/>
+          <w:kern w:val="0"/>
+          <w:sz w:val="22"/>
+          <w:szCs w:val="22"/>
+          <w:lang w:eastAsia="cs-CZ"/>
+          <w14:ligatures w14:val="none"/>
+        </w:rPr>
+        <w:t xml:space="preserve">. </w:t>
+      </w:r>
+      <w:r>
+        <w:rPr>
+          <w:rFonts w:eastAsia="Times New Roman" w:cs="Times New Roman"/>
+          <w:color w:val="000000"/>
+          <w:kern w:val="0"/>
+          <w:sz w:val="22"/>
+          <w:szCs w:val="22"/>
+          <w:lang w:eastAsia="cs-CZ"/>
+          <w14:ligatures w14:val="none"/>
+        </w:rPr>
+        <w:t xml:space="preserve">Dekáda byla proměřena od hodnoty </w:t>
+      </w:r>
+      <w:proofErr w:type="spellStart"/>
+      <w:r>
+        <w:rPr>
+          <w:rFonts w:eastAsia="Times New Roman" w:cs="Times New Roman"/>
+          <w:color w:val="000000"/>
+          <w:kern w:val="0"/>
+          <w:sz w:val="22"/>
+          <w:szCs w:val="22"/>
+          <w:lang w:eastAsia="cs-CZ"/>
+          <w14:ligatures w14:val="none"/>
+        </w:rPr>
+        <w:t>R</w:t>
+      </w:r>
+      <w:r>
+        <w:rPr>
+          <w:rFonts w:eastAsia="Times New Roman" w:cs="Times New Roman"/>
+          <w:color w:val="000000"/>
+          <w:kern w:val="0"/>
+          <w:sz w:val="22"/>
+          <w:szCs w:val="22"/>
+          <w:vertAlign w:val="subscript"/>
+          <w:lang w:eastAsia="cs-CZ"/>
+          <w14:ligatures w14:val="none"/>
+        </w:rPr>
+        <w:t>x</w:t>
+      </w:r>
+      <w:proofErr w:type="spellEnd"/>
+      <w:r>
+        <w:rPr>
+          <w:rFonts w:eastAsia="Times New Roman" w:cs="Times New Roman"/>
+          <w:color w:val="000000"/>
+          <w:kern w:val="0"/>
+          <w:sz w:val="22"/>
+          <w:szCs w:val="22"/>
+          <w:lang w:eastAsia="cs-CZ"/>
+          <w14:ligatures w14:val="none"/>
+        </w:rPr>
+        <w:t xml:space="preserve"> = 1</w:t>
+      </w:r>
+      <w:r>
+        <w:t>k</w:t>
+      </w:r>
+      <w:r>
+        <w:rPr>
+          <w:rFonts w:eastAsia="Times New Roman" w:cs="Times New Roman"/>
+          <w:color w:val="000000"/>
+          <w:kern w:val="0"/>
+          <w:sz w:val="22"/>
+          <w:szCs w:val="22"/>
+          <w:lang w:eastAsia="cs-CZ"/>
+          <w14:ligatures w14:val="none"/>
+        </w:rPr>
+        <w:t>Ω</w:t>
+      </w:r>
+      <w:r>
+        <w:rPr>
+          <w:rFonts w:eastAsia="Times New Roman" w:cs="Times New Roman"/>
+          <w:color w:val="000000"/>
+          <w:kern w:val="0"/>
+          <w:sz w:val="22"/>
+          <w:szCs w:val="22"/>
+          <w:lang w:eastAsia="cs-CZ"/>
+          <w14:ligatures w14:val="none"/>
+        </w:rPr>
+        <w:t xml:space="preserve"> až 1,</w:t>
+      </w:r>
+      <w:r>
+        <w:t>5</w:t>
+      </w:r>
+      <w:r>
+        <w:t>k</w:t>
+      </w:r>
+      <w:r>
+        <w:rPr>
+          <w:rFonts w:eastAsia="Times New Roman" w:cs="Times New Roman"/>
+          <w:color w:val="000000"/>
+          <w:kern w:val="0"/>
+          <w:sz w:val="22"/>
+          <w:szCs w:val="22"/>
+          <w:lang w:eastAsia="cs-CZ"/>
+          <w14:ligatures w14:val="none"/>
+        </w:rPr>
+        <w:t>Ω</w:t>
+      </w:r>
+      <w:r>
+        <w:rPr>
+          <w:rFonts w:eastAsia="Times New Roman" w:cs="Times New Roman"/>
+          <w:color w:val="000000"/>
+          <w:kern w:val="0"/>
+          <w:sz w:val="22"/>
+          <w:szCs w:val="22"/>
+          <w:lang w:eastAsia="cs-CZ"/>
+          <w14:ligatures w14:val="none"/>
+        </w:rPr>
+        <w:t>, v inkrementech 50</w:t>
+      </w:r>
+      <w:r>
+        <w:rPr>
+          <w:rFonts w:eastAsia="Times New Roman" w:cs="Times New Roman"/>
+          <w:color w:val="000000"/>
+          <w:kern w:val="0"/>
+          <w:sz w:val="22"/>
+          <w:szCs w:val="22"/>
+          <w:lang w:eastAsia="cs-CZ"/>
+          <w14:ligatures w14:val="none"/>
+        </w:rPr>
+        <w:t>Ω</w:t>
+      </w:r>
+      <w:r>
+        <w:rPr>
+          <w:rFonts w:eastAsia="Times New Roman" w:cs="Times New Roman"/>
+          <w:color w:val="000000"/>
+          <w:kern w:val="0"/>
+          <w:sz w:val="22"/>
+          <w:szCs w:val="22"/>
+          <w:lang w:eastAsia="cs-CZ"/>
+          <w14:ligatures w14:val="none"/>
+        </w:rPr>
+        <w:t>.</w:t>
+      </w:r>
+    </w:p>
+    <w:tbl>
+      <w:tblPr>
+        <w:tblW w:w="4170" w:type="dxa"/>
+        <w:jc w:val="center"/>
+        <w:tblCellMar>
+          <w:left w:w="70" w:type="dxa"/>
+          <w:right w:w="70" w:type="dxa"/>
+        </w:tblCellMar>
+        <w:tblLook w:val="04A0" w:firstRow="1" w:lastRow="0" w:firstColumn="1" w:lastColumn="0" w:noHBand="0" w:noVBand="1"/>
+      </w:tblPr>
+      <w:tblGrid>
+        <w:gridCol w:w="999"/>
+        <w:gridCol w:w="1724"/>
+        <w:gridCol w:w="1447"/>
+      </w:tblGrid>
+      <w:tr>
+        <w:trPr>
+          <w:trHeight w:val="300"/>
+          <w:jc w:val="center"/>
+        </w:trPr>
+        <w:tc>
+          <w:tcPr>
+            <w:tcW w:w="999" w:type="dxa"/>
+            <w:tcBorders>
+              <w:top w:val="single" w:sz="8" w:space="0" w:color="auto"/>
+              <w:left w:val="single" w:sz="8" w:space="0" w:color="auto"/>
+              <w:bottom w:val="single" w:sz="8" w:space="0" w:color="auto"/>
+              <w:right w:val="single" w:sz="4" w:space="0" w:color="auto"/>
+            </w:tcBorders>
+            <w:shd w:val="clear" w:color="auto" w:fill="7F7F7F" w:themeFill="text1" w:themeFillTint="80"/>
+          </w:tcPr>
+          <w:p>
+            <w:pPr>
+              <w:spacing w:after="0" w:line="240" w:lineRule="auto"/>
+              <w:jc w:val="center"/>
+              <w:rPr>
+                <w:rFonts w:eastAsia="Times New Roman" w:cs="Times New Roman"/>
+                <w:b/>
+                <w:bCs/>
+                <w:color w:val="000000"/>
+                <w:kern w:val="0"/>
+                <w:sz w:val="22"/>
+                <w:szCs w:val="22"/>
+                <w:lang w:eastAsia="cs-CZ"/>
+                <w14:ligatures w14:val="none"/>
+              </w:rPr>
+            </w:pPr>
+            <w:r>
+              <w:rPr>
+                <w:rFonts w:eastAsia="Times New Roman" w:cs="Times New Roman"/>
+                <w:b/>
+                <w:bCs/>
+                <w:color w:val="000000"/>
+                <w:kern w:val="0"/>
+                <w:sz w:val="22"/>
+                <w:szCs w:val="22"/>
+                <w:lang w:eastAsia="cs-CZ"/>
+                <w14:ligatures w14:val="none"/>
+              </w:rPr>
+              <w:t>Rozsah</w:t>
+            </w:r>
+          </w:p>
+        </w:tc>
+        <w:tc>
+          <w:tcPr>
+            <w:tcW w:w="1724" w:type="dxa"/>
+            <w:tcBorders>
+              <w:top w:val="single" w:sz="8" w:space="0" w:color="auto"/>
+              <w:left w:val="single" w:sz="8" w:space="0" w:color="auto"/>
+              <w:bottom w:val="single" w:sz="8" w:space="0" w:color="auto"/>
+              <w:right w:val="single" w:sz="4" w:space="0" w:color="auto"/>
+            </w:tcBorders>
+            <w:shd w:val="clear" w:color="000000" w:fill="D9D9D9"/>
+            <w:noWrap/>
+            <w:vAlign w:val="bottom"/>
+            <w:hideMark/>
+          </w:tcPr>
+          <w:p>
+            <w:pPr>
+              <w:spacing w:after="0" w:line="240" w:lineRule="auto"/>
+              <w:jc w:val="center"/>
+              <w:rPr>
+                <w:rFonts w:eastAsia="Times New Roman" w:cs="Times New Roman"/>
+                <w:b/>
+                <w:bCs/>
+                <w:color w:val="000000"/>
+                <w:kern w:val="0"/>
+                <w:sz w:val="22"/>
+                <w:szCs w:val="22"/>
+                <w:lang w:eastAsia="cs-CZ"/>
+                <w14:ligatures w14:val="none"/>
+              </w:rPr>
+            </w:pPr>
+            <w:r>
+              <w:rPr>
+                <w:rFonts w:eastAsia="Times New Roman" w:cs="Times New Roman"/>
+                <w:b/>
+                <w:bCs/>
+                <w:color w:val="000000"/>
+                <w:kern w:val="0"/>
+                <w:sz w:val="22"/>
+                <w:szCs w:val="22"/>
+                <w:lang w:eastAsia="cs-CZ"/>
+                <w14:ligatures w14:val="none"/>
+              </w:rPr>
+              <w:t>U</w:t>
+            </w:r>
+            <w:r>
+              <w:rPr>
+                <w:rFonts w:eastAsia="Times New Roman" w:cs="Times New Roman"/>
+                <w:b/>
+                <w:bCs/>
+                <w:color w:val="000000"/>
+                <w:kern w:val="0"/>
+                <w:sz w:val="22"/>
+                <w:szCs w:val="22"/>
+                <w:vertAlign w:val="subscript"/>
+                <w:lang w:eastAsia="cs-CZ"/>
+                <w14:ligatures w14:val="none"/>
+              </w:rPr>
+              <w:t>BD</w:t>
+            </w:r>
+          </w:p>
+        </w:tc>
+        <w:tc>
+          <w:tcPr>
+            <w:tcW w:w="1447" w:type="dxa"/>
+            <w:tcBorders>
+              <w:top w:val="single" w:sz="8" w:space="0" w:color="auto"/>
+              <w:left w:val="nil"/>
+              <w:bottom w:val="single" w:sz="8" w:space="0" w:color="auto"/>
+              <w:right w:val="single" w:sz="8" w:space="0" w:color="auto"/>
+            </w:tcBorders>
+            <w:shd w:val="clear" w:color="000000" w:fill="D9D9D9"/>
+            <w:noWrap/>
+            <w:vAlign w:val="bottom"/>
+            <w:hideMark/>
+          </w:tcPr>
+          <w:p>
+            <w:pPr>
+              <w:spacing w:after="0" w:line="240" w:lineRule="auto"/>
+              <w:jc w:val="center"/>
+              <w:rPr>
+                <w:rFonts w:eastAsia="Times New Roman" w:cs="Times New Roman"/>
+                <w:b/>
+                <w:bCs/>
+                <w:color w:val="000000"/>
+                <w:kern w:val="0"/>
+                <w:sz w:val="22"/>
+                <w:szCs w:val="22"/>
+                <w:lang w:eastAsia="cs-CZ"/>
+                <w14:ligatures w14:val="none"/>
+              </w:rPr>
+            </w:pPr>
+            <w:proofErr w:type="spellStart"/>
+            <w:r>
+              <w:rPr>
+                <w:rFonts w:eastAsia="Times New Roman" w:cs="Times New Roman"/>
+                <w:b/>
+                <w:bCs/>
+                <w:color w:val="000000"/>
+                <w:kern w:val="0"/>
+                <w:sz w:val="22"/>
+                <w:szCs w:val="22"/>
+                <w:lang w:eastAsia="cs-CZ"/>
+                <w14:ligatures w14:val="none"/>
+              </w:rPr>
+              <w:t>R</w:t>
+            </w:r>
+            <w:r>
+              <w:rPr>
+                <w:rFonts w:eastAsia="Times New Roman" w:cs="Times New Roman"/>
+                <w:b/>
+                <w:bCs/>
+                <w:color w:val="000000"/>
+                <w:kern w:val="0"/>
+                <w:sz w:val="22"/>
+                <w:szCs w:val="22"/>
+                <w:vertAlign w:val="subscript"/>
+                <w:lang w:eastAsia="cs-CZ"/>
+                <w14:ligatures w14:val="none"/>
+              </w:rPr>
+              <w:t>x</w:t>
+            </w:r>
+            <w:proofErr w:type="spellEnd"/>
+            <w:r>
+              <w:rPr>
+                <w:rFonts w:eastAsia="Times New Roman" w:cs="Times New Roman"/>
+                <w:b/>
+                <w:bCs/>
+                <w:color w:val="000000"/>
+                <w:kern w:val="0"/>
+                <w:sz w:val="22"/>
+                <w:szCs w:val="22"/>
+                <w:lang w:eastAsia="cs-CZ"/>
+                <w14:ligatures w14:val="none"/>
+              </w:rPr>
+              <w:t xml:space="preserve"> [</w:t>
+            </w:r>
+            <w:r>
+              <w:rPr>
+                <w:rFonts w:eastAsia="Times New Roman" w:cs="Times New Roman"/>
+                <w:b/>
+                <w:bCs/>
+                <w:color w:val="000000"/>
+                <w:kern w:val="0"/>
+                <w:sz w:val="22"/>
+                <w:szCs w:val="22"/>
+                <w:lang w:eastAsia="cs-CZ"/>
+                <w14:ligatures w14:val="none"/>
+              </w:rPr>
+              <w:t>Ω</w:t>
+            </w:r>
+            <w:r>
+              <w:rPr>
+                <w:rFonts w:eastAsia="Times New Roman" w:cs="Times New Roman"/>
+                <w:b/>
+                <w:bCs/>
+                <w:color w:val="000000"/>
+                <w:kern w:val="0"/>
+                <w:sz w:val="22"/>
+                <w:szCs w:val="22"/>
+                <w:lang w:eastAsia="cs-CZ"/>
+                <w14:ligatures w14:val="none"/>
+              </w:rPr>
+              <w:t>]</w:t>
+            </w:r>
+          </w:p>
+        </w:tc>
+      </w:tr>
+      <w:tr>
+        <w:trPr>
+          <w:trHeight w:val="290"/>
+          <w:jc w:val="center"/>
+        </w:trPr>
+        <w:tc>
+          <w:tcPr>
+            <w:tcW w:w="999" w:type="dxa"/>
+            <w:tcBorders>
+              <w:top w:val="nil"/>
+              <w:left w:val="single" w:sz="8" w:space="0" w:color="auto"/>
+              <w:bottom w:val="single" w:sz="4" w:space="0" w:color="auto"/>
+              <w:right w:val="single" w:sz="4" w:space="0" w:color="auto"/>
+            </w:tcBorders>
+            <w:shd w:val="clear" w:color="auto" w:fill="D1D1D1" w:themeFill="background2" w:themeFillShade="E6"/>
+          </w:tcPr>
+          <w:p>
+            <w:pPr>
+              <w:tabs>
+                <w:tab w:val="center" w:pos="410"/>
+                <w:tab w:val="right" w:pos="820"/>
+              </w:tabs>
+              <w:spacing w:after="0" w:line="240" w:lineRule="auto"/>
+              <w:jc w:val="center"/>
+              <w:rPr>
+                <w:rFonts w:eastAsia="Times New Roman" w:cs="Times New Roman"/>
+                <w:b/>
+                <w:bCs/>
+                <w:color w:val="000000"/>
+                <w:kern w:val="0"/>
+                <w:sz w:val="22"/>
+                <w:szCs w:val="22"/>
+                <w:lang w:eastAsia="cs-CZ"/>
+                <w14:ligatures w14:val="none"/>
+              </w:rPr>
+            </w:pPr>
+            <w:proofErr w:type="spellStart"/>
+            <w:r>
+              <w:rPr>
+                <w:rFonts w:eastAsia="Times New Roman" w:cs="Times New Roman"/>
+                <w:b/>
+                <w:bCs/>
+                <w:color w:val="000000"/>
+                <w:kern w:val="0"/>
+                <w:sz w:val="22"/>
+                <w:szCs w:val="22"/>
+                <w:lang w:eastAsia="cs-CZ"/>
+                <w14:ligatures w14:val="none"/>
+              </w:rPr>
+              <w:t>mV</w:t>
+            </w:r>
+            <w:proofErr w:type="spellEnd"/>
+          </w:p>
+        </w:tc>
+        <w:tc>
+          <w:tcPr>
+            <w:tcW w:w="1724" w:type="dxa"/>
+            <w:tcBorders>
+              <w:top w:val="nil"/>
+              <w:left w:val="single" w:sz="8" w:space="0" w:color="auto"/>
+              <w:bottom w:val="single" w:sz="4" w:space="0" w:color="auto"/>
+              <w:right w:val="single" w:sz="4" w:space="0" w:color="auto"/>
+            </w:tcBorders>
+            <w:noWrap/>
+            <w:vAlign w:val="bottom"/>
+            <w:hideMark/>
+          </w:tcPr>
+          <w:p>
+            <w:pPr>
+              <w:spacing w:after="0" w:line="240" w:lineRule="auto"/>
+              <w:jc w:val="center"/>
+              <w:rPr>
+                <w:rFonts w:eastAsia="Times New Roman" w:cs="Times New Roman"/>
+                <w:color w:val="000000"/>
+                <w:kern w:val="0"/>
+                <w:sz w:val="22"/>
+                <w:szCs w:val="22"/>
+                <w:lang w:eastAsia="cs-CZ"/>
+                <w14:ligatures w14:val="none"/>
+              </w:rPr>
+            </w:pPr>
+            <w:r>
+              <w:rPr>
+                <w:rFonts w:eastAsia="Times New Roman" w:cs="Times New Roman"/>
+                <w:color w:val="000000"/>
+                <w:kern w:val="0"/>
+                <w:sz w:val="22"/>
+                <w:szCs w:val="22"/>
+                <w:lang w:eastAsia="cs-CZ"/>
+                <w14:ligatures w14:val="none"/>
+              </w:rPr>
+              <w:t>23,073</w:t>
+            </w:r>
+          </w:p>
+        </w:tc>
+        <w:tc>
+          <w:tcPr>
+            <w:tcW w:w="1447" w:type="dxa"/>
+            <w:tcBorders>
+              <w:top w:val="nil"/>
+              <w:left w:val="nil"/>
+              <w:bottom w:val="single" w:sz="4" w:space="0" w:color="auto"/>
+              <w:right w:val="single" w:sz="8" w:space="0" w:color="auto"/>
+            </w:tcBorders>
+            <w:noWrap/>
+            <w:vAlign w:val="bottom"/>
+            <w:hideMark/>
+          </w:tcPr>
+          <w:p>
+            <w:pPr>
+              <w:keepNext/>
+              <w:spacing w:after="0" w:line="240" w:lineRule="auto"/>
+              <w:jc w:val="center"/>
+              <w:rPr>
+                <w:rFonts w:eastAsia="Times New Roman" w:cs="Times New Roman"/>
+                <w:color w:val="000000"/>
+                <w:kern w:val="0"/>
+                <w:sz w:val="22"/>
+                <w:szCs w:val="22"/>
+                <w:lang w:eastAsia="cs-CZ"/>
+                <w14:ligatures w14:val="none"/>
+              </w:rPr>
+            </w:pPr>
+            <w:r>
+              <w:rPr>
+                <w:rFonts w:eastAsia="Times New Roman" w:cs="Times New Roman"/>
+                <w:color w:val="000000"/>
+                <w:kern w:val="0"/>
+                <w:sz w:val="22"/>
+                <w:szCs w:val="22"/>
+                <w:lang w:eastAsia="cs-CZ"/>
+                <w14:ligatures w14:val="none"/>
+              </w:rPr>
+              <w:t>-23,057</w:t>
+            </w:r>
+          </w:p>
+        </w:tc>
+      </w:tr>
+      <w:tr>
+        <w:trPr>
+          <w:trHeight w:val="290"/>
+          <w:jc w:val="center"/>
+        </w:trPr>
+        <w:tc>
+          <w:tcPr>
+            <w:tcW w:w="999" w:type="dxa"/>
+            <w:tcBorders>
+              <w:top w:val="single" w:sz="4" w:space="0" w:color="auto"/>
+              <w:left w:val="single" w:sz="8" w:space="0" w:color="auto"/>
+              <w:bottom w:val="single" w:sz="4" w:space="0" w:color="auto"/>
+              <w:right w:val="single" w:sz="4" w:space="0" w:color="auto"/>
+            </w:tcBorders>
+            <w:shd w:val="clear" w:color="auto" w:fill="D1D1D1" w:themeFill="background2" w:themeFillShade="E6"/>
+          </w:tcPr>
+          <w:p>
+            <w:pPr>
+              <w:tabs>
+                <w:tab w:val="center" w:pos="410"/>
+                <w:tab w:val="right" w:pos="820"/>
+              </w:tabs>
+              <w:spacing w:after="0" w:line="240" w:lineRule="auto"/>
+              <w:jc w:val="center"/>
+              <w:rPr>
+                <w:rFonts w:eastAsia="Times New Roman" w:cs="Times New Roman"/>
+                <w:b/>
+                <w:bCs/>
+                <w:color w:val="000000"/>
+                <w:kern w:val="0"/>
+                <w:sz w:val="22"/>
+                <w:szCs w:val="22"/>
+                <w:lang w:eastAsia="cs-CZ"/>
+                <w14:ligatures w14:val="none"/>
+              </w:rPr>
+            </w:pPr>
+            <w:r>
+              <w:rPr>
+                <w:rFonts w:eastAsia="Times New Roman" w:cs="Times New Roman"/>
+                <w:b/>
+                <w:bCs/>
+                <w:color w:val="000000"/>
+                <w:kern w:val="0"/>
+                <w:sz w:val="22"/>
+                <w:szCs w:val="22"/>
+                <w:lang w:eastAsia="cs-CZ"/>
+                <w14:ligatures w14:val="none"/>
+              </w:rPr>
+              <w:t>V</w:t>
+            </w:r>
+          </w:p>
+        </w:tc>
+        <w:tc>
+          <w:tcPr>
+            <w:tcW w:w="1724" w:type="dxa"/>
+            <w:tcBorders>
+              <w:top w:val="single" w:sz="4" w:space="0" w:color="auto"/>
+              <w:left w:val="single" w:sz="8" w:space="0" w:color="auto"/>
+              <w:bottom w:val="single" w:sz="4" w:space="0" w:color="auto"/>
+              <w:right w:val="single" w:sz="4" w:space="0" w:color="auto"/>
+            </w:tcBorders>
+            <w:noWrap/>
+            <w:vAlign w:val="bottom"/>
+          </w:tcPr>
+          <w:p>
+            <w:pPr>
+              <w:spacing w:after="0" w:line="240" w:lineRule="auto"/>
+              <w:jc w:val="center"/>
+              <w:rPr>
+                <w:rFonts w:eastAsia="Times New Roman" w:cs="Times New Roman"/>
+                <w:color w:val="000000"/>
+                <w:kern w:val="0"/>
+                <w:sz w:val="22"/>
+                <w:szCs w:val="22"/>
+                <w:lang w:eastAsia="cs-CZ"/>
+                <w14:ligatures w14:val="none"/>
+              </w:rPr>
+            </w:pPr>
+            <w:r>
+              <w:rPr>
+                <w:rFonts w:eastAsia="Times New Roman" w:cs="Times New Roman"/>
+                <w:color w:val="000000"/>
+                <w:kern w:val="0"/>
+                <w:sz w:val="22"/>
+                <w:szCs w:val="22"/>
+                <w:lang w:eastAsia="cs-CZ"/>
+                <w14:ligatures w14:val="none"/>
+              </w:rPr>
+              <w:t>0,92</w:t>
+            </w:r>
+          </w:p>
+        </w:tc>
+        <w:tc>
+          <w:tcPr>
+            <w:tcW w:w="1447" w:type="dxa"/>
+            <w:tcBorders>
+              <w:top w:val="single" w:sz="4" w:space="0" w:color="auto"/>
+              <w:left w:val="nil"/>
+              <w:bottom w:val="single" w:sz="4" w:space="0" w:color="auto"/>
+              <w:right w:val="single" w:sz="8" w:space="0" w:color="auto"/>
+            </w:tcBorders>
+            <w:noWrap/>
+            <w:vAlign w:val="bottom"/>
+          </w:tcPr>
+          <w:p>
+            <w:pPr>
+              <w:keepNext/>
+              <w:spacing w:after="0" w:line="240" w:lineRule="auto"/>
+              <w:jc w:val="center"/>
+              <w:rPr>
+                <w:rFonts w:eastAsia="Times New Roman" w:cs="Times New Roman"/>
+                <w:color w:val="000000"/>
+                <w:kern w:val="0"/>
+                <w:sz w:val="22"/>
+                <w:szCs w:val="22"/>
+                <w:lang w:eastAsia="cs-CZ"/>
+                <w14:ligatures w14:val="none"/>
+              </w:rPr>
+            </w:pPr>
+            <w:r>
+              <w:rPr>
+                <w:rFonts w:eastAsia="Times New Roman" w:cs="Times New Roman"/>
+                <w:color w:val="000000"/>
+                <w:kern w:val="0"/>
+                <w:sz w:val="22"/>
+                <w:szCs w:val="22"/>
+                <w:lang w:eastAsia="cs-CZ"/>
+                <w14:ligatures w14:val="none"/>
+              </w:rPr>
+              <w:t>0,52</w:t>
+            </w:r>
+          </w:p>
+        </w:tc>
+      </w:tr>
+    </w:tbl>
+    <w:p>
+      <w:pPr>
+        <w:rPr>
+          <w:rFonts w:eastAsia="Times New Roman" w:cs="Times New Roman"/>
+          <w:color w:val="000000"/>
+          <w:kern w:val="0"/>
+          <w:sz w:val="22"/>
+          <w:szCs w:val="22"/>
+          <w:lang w:eastAsia="cs-CZ"/>
+          <w14:ligatures w14:val="none"/>
+        </w:rPr>
+      </w:pPr>
+    </w:p>
     <w:p/>
-    <w:p/>
+    <w:p>
+      <w:r>
+        <w:t>Zadání 6.1.4</w:t>
+      </w:r>
+    </w:p>
+    <w:p>
+      <w:r>
+        <w:t>Zadání 6.1.5</w:t>
+      </w:r>
+    </w:p>
     <w:p>
       <w:pPr>
         <w:pStyle w:val="Heading1"/>
@@ -9979,7 +10594,7 @@
   <w:style w:type="paragraph" w:default="1" w:styleId="Normal">
     <w:name w:val="Normal"/>
     <w:qFormat/>
-    <w:rsid w:val="00C10363"/>
+    <w:rsid w:val="005C1FD5"/>
     <w:pPr>
       <w:spacing w:after="120"/>
       <w:jc w:val="both"/>

</xml_diff>